<commit_message>
[Laptop] more work on Pegasus
</commit_message>
<xml_diff>
--- a/CS205/PegasusEssay.docx
+++ b/CS205/PegasusEssay.docx
@@ -77,18 +77,61 @@
       </w:r>
     </w:p>
     <w:p>
-      <w:r>
-        <w:t>Throughout this paper we will discuss the use of spyware for population surveillance in the interests of national security. Specifically, we will discuss the use of Pegasus, a piece of spyware developed by the NSO group, a for-profit Israeli cyber-arms organization</w:t>
-      </w:r>
-      <w:r>
+      <w:pPr>
+        <w:rPr>
+          <w:sz w:val="24"/>
+          <w:szCs w:val="24"/>
+        </w:rPr>
+      </w:pPr>
+      <w:r>
+        <w:rPr>
+          <w:sz w:val="24"/>
+          <w:szCs w:val="24"/>
+        </w:rPr>
+        <w:t xml:space="preserve">Throughout this paper we will discuss the </w:t>
+      </w:r>
+      <w:r>
+        <w:rPr>
+          <w:sz w:val="24"/>
+          <w:szCs w:val="24"/>
+        </w:rPr>
+        <w:t>use</w:t>
+      </w:r>
+      <w:r>
+        <w:rPr>
+          <w:sz w:val="24"/>
+          <w:szCs w:val="24"/>
+        </w:rPr>
+        <w:t xml:space="preserve"> of spyware for population surveillance in the interests of national security. Specifically, we will discuss the use of Pegasus, a piece of spyware developed by the NSO group, a for-profit Israeli cyber-arms organization</w:t>
+      </w:r>
+      <w:r>
+        <w:rPr>
+          <w:sz w:val="24"/>
+          <w:szCs w:val="24"/>
+        </w:rPr>
         <w:t xml:space="preserve"> and we will analyze investigations into the NSO group and Pegasus. </w:t>
       </w:r>
       <w:r>
+        <w:rPr>
+          <w:sz w:val="24"/>
+          <w:szCs w:val="24"/>
+        </w:rPr>
         <w:t>We will attempt to reason</w:t>
       </w:r>
       <w:r>
+        <w:rPr>
+          <w:sz w:val="24"/>
+          <w:szCs w:val="24"/>
+        </w:rPr>
         <w:t xml:space="preserve"> about the ethics surrounding the use of Pegasus and dive deep into its technical abilities</w:t>
       </w:r>
+      <w:r>
+        <w:rPr>
+          <w:sz w:val="24"/>
+          <w:szCs w:val="24"/>
+        </w:rPr>
+        <w:t>.</w:t>
+      </w:r>
     </w:p>
     <w:p>
       <w:pPr>
@@ -102,23 +145,242 @@
       </w:r>
     </w:p>
     <w:p>
-      <w:r>
+      <w:pPr>
+        <w:rPr>
+          <w:sz w:val="24"/>
+          <w:szCs w:val="24"/>
+        </w:rPr>
+      </w:pPr>
+      <w:r>
+        <w:rPr>
+          <w:sz w:val="24"/>
+          <w:szCs w:val="24"/>
+        </w:rPr>
         <w:t xml:space="preserve">The NSO group developed the spyware known as Pegasus. To </w:t>
       </w:r>
       <w:r>
+        <w:rPr>
+          <w:sz w:val="24"/>
+          <w:szCs w:val="24"/>
+        </w:rPr>
         <w:t>the NSO group</w:t>
       </w:r>
       <w:r>
+        <w:rPr>
+          <w:sz w:val="24"/>
+          <w:szCs w:val="24"/>
+        </w:rPr>
         <w:t>, its success is their success.</w:t>
       </w:r>
       <w:r>
-        <w:t xml:space="preserve"> “</w:t>
-      </w:r>
-      <w:r>
-        <w:t>Co-founded by two high-school friends in 2010, NSO Group specialized in breaking into mobile phones from the very beginning. As the devices spread across the planet, governments eager to listen in came calling. The company grew into a major player in the spyware market, with dozens of clients, over 700 employees, and revenues of $250 million as of 2018.</w:t>
-      </w:r>
-      <w:r>
-        <w:t xml:space="preserve">” (7) </w:t>
+        <w:rPr>
+          <w:sz w:val="24"/>
+          <w:szCs w:val="24"/>
+        </w:rPr>
+        <w:t xml:space="preserve"> Co-founded</w:t>
+      </w:r>
+      <w:r>
+        <w:rPr>
+          <w:sz w:val="24"/>
+          <w:szCs w:val="24"/>
+        </w:rPr>
+        <w:t xml:space="preserve"> in 2010</w:t>
+      </w:r>
+      <w:r>
+        <w:rPr>
+          <w:sz w:val="24"/>
+          <w:szCs w:val="24"/>
+        </w:rPr>
+        <w:t xml:space="preserve"> by two friends in</w:t>
+      </w:r>
+      <w:r>
+        <w:rPr>
+          <w:sz w:val="24"/>
+          <w:szCs w:val="24"/>
+        </w:rPr>
+        <w:t xml:space="preserve"> high school</w:t>
+      </w:r>
+      <w:r>
+        <w:rPr>
+          <w:sz w:val="24"/>
+          <w:szCs w:val="24"/>
+        </w:rPr>
+        <w:t xml:space="preserve">, </w:t>
+      </w:r>
+      <w:r>
+        <w:rPr>
+          <w:sz w:val="24"/>
+          <w:szCs w:val="24"/>
+        </w:rPr>
+        <w:t>they</w:t>
+      </w:r>
+      <w:r>
+        <w:rPr>
+          <w:sz w:val="24"/>
+          <w:szCs w:val="24"/>
+        </w:rPr>
+        <w:t xml:space="preserve"> specialized in </w:t>
+      </w:r>
+      <w:r>
+        <w:rPr>
+          <w:sz w:val="24"/>
+          <w:szCs w:val="24"/>
+        </w:rPr>
+        <w:t>hacking</w:t>
+      </w:r>
+      <w:r>
+        <w:rPr>
+          <w:sz w:val="24"/>
+          <w:szCs w:val="24"/>
+        </w:rPr>
+        <w:t xml:space="preserve"> mobile </w:t>
+      </w:r>
+      <w:r>
+        <w:rPr>
+          <w:sz w:val="24"/>
+          <w:szCs w:val="24"/>
+        </w:rPr>
+        <w:t>devices</w:t>
+      </w:r>
+      <w:r>
+        <w:rPr>
+          <w:sz w:val="24"/>
+          <w:szCs w:val="24"/>
+        </w:rPr>
+        <w:t xml:space="preserve"> from the </w:t>
+      </w:r>
+      <w:r>
+        <w:rPr>
+          <w:sz w:val="24"/>
+          <w:szCs w:val="24"/>
+        </w:rPr>
+        <w:t>start</w:t>
+      </w:r>
+      <w:r>
+        <w:rPr>
+          <w:sz w:val="24"/>
+          <w:szCs w:val="24"/>
+        </w:rPr>
+        <w:t xml:space="preserve">. </w:t>
+      </w:r>
+      <w:r>
+        <w:rPr>
+          <w:sz w:val="24"/>
+          <w:szCs w:val="24"/>
+        </w:rPr>
+        <w:t>“</w:t>
+      </w:r>
+      <w:r>
+        <w:rPr>
+          <w:sz w:val="24"/>
+          <w:szCs w:val="24"/>
+        </w:rPr>
+        <w:t>As the devices spread across the planet, governments eager to listen in came calling.</w:t>
+      </w:r>
+      <w:r>
+        <w:rPr>
+          <w:sz w:val="24"/>
+          <w:szCs w:val="24"/>
+        </w:rPr>
+        <w:t>”</w:t>
+      </w:r>
+      <w:r>
+        <w:rPr>
+          <w:sz w:val="24"/>
+          <w:szCs w:val="24"/>
+        </w:rPr>
+        <w:t xml:space="preserve"> (7)</w:t>
+      </w:r>
+      <w:r>
+        <w:rPr>
+          <w:sz w:val="24"/>
+          <w:szCs w:val="24"/>
+        </w:rPr>
+        <w:t xml:space="preserve"> The </w:t>
+      </w:r>
+      <w:r>
+        <w:rPr>
+          <w:sz w:val="24"/>
+          <w:szCs w:val="24"/>
+        </w:rPr>
+        <w:t>NSO group</w:t>
+      </w:r>
+      <w:r>
+        <w:rPr>
+          <w:sz w:val="24"/>
+          <w:szCs w:val="24"/>
+        </w:rPr>
+        <w:t xml:space="preserve"> grew </w:t>
+      </w:r>
+      <w:r>
+        <w:rPr>
+          <w:sz w:val="24"/>
+          <w:szCs w:val="24"/>
+        </w:rPr>
+        <w:t>quickly with the new attention. As</w:t>
+      </w:r>
+      <w:r>
+        <w:rPr>
+          <w:sz w:val="24"/>
+          <w:szCs w:val="24"/>
+        </w:rPr>
+        <w:t xml:space="preserve"> a major player in the spyware market, with dozens of clients</w:t>
+      </w:r>
+      <w:r>
+        <w:rPr>
+          <w:sz w:val="24"/>
+          <w:szCs w:val="24"/>
+        </w:rPr>
+        <w:t xml:space="preserve"> and </w:t>
+      </w:r>
+      <w:r>
+        <w:rPr>
+          <w:sz w:val="24"/>
+          <w:szCs w:val="24"/>
+        </w:rPr>
+        <w:t xml:space="preserve">over 700 </w:t>
+      </w:r>
+      <w:r>
+        <w:rPr>
+          <w:sz w:val="24"/>
+          <w:szCs w:val="24"/>
+        </w:rPr>
+        <w:t>employees, their income has reached levels</w:t>
+      </w:r>
+      <w:r>
+        <w:rPr>
+          <w:sz w:val="24"/>
+          <w:szCs w:val="24"/>
+        </w:rPr>
+        <w:t xml:space="preserve"> of</w:t>
+      </w:r>
+      <w:r>
+        <w:rPr>
+          <w:sz w:val="24"/>
+          <w:szCs w:val="24"/>
+        </w:rPr>
+        <w:t xml:space="preserve"> around</w:t>
+      </w:r>
+      <w:r>
+        <w:rPr>
+          <w:sz w:val="24"/>
+          <w:szCs w:val="24"/>
+        </w:rPr>
+        <w:t xml:space="preserve"> $250 mill</w:t>
+      </w:r>
+      <w:r>
+        <w:rPr>
+          <w:sz w:val="24"/>
+          <w:szCs w:val="24"/>
+        </w:rPr>
+        <w:t>ion annually as of</w:t>
+      </w:r>
+      <w:r>
+        <w:rPr>
+          <w:sz w:val="24"/>
+          <w:szCs w:val="24"/>
+        </w:rPr>
+        <w:t xml:space="preserve"> 2018. </w:t>
       </w:r>
     </w:p>
     <w:p>
@@ -130,8 +392,46 @@
       </w:r>
     </w:p>
     <w:p>
-      <w:r>
-        <w:t>As mentioned in the previous subsection, the customers of NSO, and consumers of Pegasus are nation state governments. These governments are allegedly purchasing such a product to help ensure greater national security for themselves. Exactly what national security means will be discussed in the ethical analysis portion of this paper. Nation state governments can benefit from the use of Pegasus to support their interests, but are also very much at risk of such a tool being used by their enemies against them.</w:t>
+      <w:pPr>
+        <w:rPr>
+          <w:sz w:val="24"/>
+          <w:szCs w:val="24"/>
+        </w:rPr>
+      </w:pPr>
+      <w:r>
+        <w:rPr>
+          <w:sz w:val="24"/>
+          <w:szCs w:val="24"/>
+        </w:rPr>
+        <w:t xml:space="preserve">As mentioned in the previous subsection, the customers of NSO, and consumers of Pegasus are nation state governments. These governments are allegedly purchasing such a product to help ensure greater national security for themselves. Exactly what national security means will be discussed in the ethical analysis portion of this paper. </w:t>
+      </w:r>
+      <w:r>
+        <w:rPr>
+          <w:sz w:val="24"/>
+          <w:szCs w:val="24"/>
+        </w:rPr>
+        <w:t>National</w:t>
+      </w:r>
+      <w:r>
+        <w:rPr>
+          <w:sz w:val="24"/>
+          <w:szCs w:val="24"/>
+        </w:rPr>
+        <w:t xml:space="preserve"> state governments can benefit from the use of Pegasus to support their </w:t>
+      </w:r>
+      <w:r>
+        <w:rPr>
+          <w:sz w:val="24"/>
+          <w:szCs w:val="24"/>
+        </w:rPr>
+        <w:t>interests but</w:t>
+      </w:r>
+      <w:r>
+        <w:rPr>
+          <w:sz w:val="24"/>
+          <w:szCs w:val="24"/>
+        </w:rPr>
+        <w:t xml:space="preserve"> are also at risk of such a tool being used by their enemies.</w:t>
       </w:r>
     </w:p>
     <w:p>
@@ -143,8 +443,53 @@
       </w:r>
     </w:p>
     <w:p>
-      <w:r>
-        <w:t>The NSO group’s product targets smart phones. As such, it is not a leap to say that Pegasus targets all people. The populations of all nation states are in the crosshairs of this technology. To these populations, spyware can once again be a benefit, constraint, or outright danger depending on who you are.</w:t>
+      <w:pPr>
+        <w:rPr>
+          <w:sz w:val="24"/>
+          <w:szCs w:val="24"/>
+        </w:rPr>
+      </w:pPr>
+      <w:r>
+        <w:rPr>
+          <w:sz w:val="24"/>
+          <w:szCs w:val="24"/>
+        </w:rPr>
+        <w:t xml:space="preserve">The NSO group’s product targets smart </w:t>
+      </w:r>
+      <w:r>
+        <w:rPr>
+          <w:sz w:val="24"/>
+          <w:szCs w:val="24"/>
+        </w:rPr>
+        <w:t>mobile devices</w:t>
+      </w:r>
+      <w:r>
+        <w:rPr>
+          <w:sz w:val="24"/>
+          <w:szCs w:val="24"/>
+        </w:rPr>
+        <w:t>. As such, it is not a leap to say that Pegasus targets all people</w:t>
+      </w:r>
+      <w:r>
+        <w:rPr>
+          <w:sz w:val="24"/>
+          <w:szCs w:val="24"/>
+        </w:rPr>
+        <w:t xml:space="preserve"> living in developed </w:t>
+      </w:r>
+      <w:r>
+        <w:rPr>
+          <w:sz w:val="24"/>
+          <w:szCs w:val="24"/>
+        </w:rPr>
+        <w:t>regions of the world</w:t>
+      </w:r>
+      <w:r>
+        <w:rPr>
+          <w:sz w:val="24"/>
+          <w:szCs w:val="24"/>
+        </w:rPr>
+        <w:t>. The populations of all nation states are in the crosshairs of this technology. To these populations, spyware can once again be a benefit, constraint, or outright danger depending on who you are.</w:t>
       </w:r>
     </w:p>
     <w:p>
@@ -161,24 +506,63 @@
         <w:rPr>
           <w:rFonts w:ascii="Times New Roman" w:hAnsi="Times New Roman" w:cs="Times New Roman"/>
           <w:bCs w:val="0"/>
-          <w:sz w:val="18"/>
+          <w:sz w:val="24"/>
+          <w:szCs w:val="24"/>
         </w:rPr>
       </w:pPr>
       <w:r>
         <w:rPr>
           <w:rFonts w:ascii="Times New Roman" w:hAnsi="Times New Roman" w:cs="Times New Roman"/>
           <w:bCs w:val="0"/>
-          <w:sz w:val="18"/>
-        </w:rPr>
-        <w:t xml:space="preserve">Journalists are a part of the world’s population, but their relationship with surveillance is unique. It is the job of a journalist to surveil the world around them, record what they see, and report any findings of consequence to organizations that will help shine a spotlight on their findings so that society may have a better chance of recognizing and managing harmful forces. </w:t>
+          <w:sz w:val="24"/>
+          <w:szCs w:val="24"/>
+        </w:rPr>
+        <w:t>Journalists are a part of the world’s population, but their relationship with surveillance is unique. It is the job of a journalist to surveil the world around them, record what they see, and report any findings of consequence to organizations that will help sh</w:t>
       </w:r>
       <w:r>
         <w:rPr>
           <w:rFonts w:ascii="Times New Roman" w:hAnsi="Times New Roman" w:cs="Times New Roman"/>
           <w:bCs w:val="0"/>
-          <w:sz w:val="18"/>
-        </w:rPr>
-        <w:t>It is usually the case that journalists target and expose entities that would rather not be in the public’s eye. A successful journalist must operate unseen. Surveillance directly counters the need to be unseen. From a journalist’s perspective, Pegasus is a harmful force.</w:t>
+          <w:sz w:val="24"/>
+          <w:szCs w:val="24"/>
+        </w:rPr>
+        <w:t>are</w:t>
+      </w:r>
+      <w:r>
+        <w:rPr>
+          <w:rFonts w:ascii="Times New Roman" w:hAnsi="Times New Roman" w:cs="Times New Roman"/>
+          <w:bCs w:val="0"/>
+          <w:sz w:val="24"/>
+          <w:szCs w:val="24"/>
+        </w:rPr>
+        <w:t xml:space="preserve"> their findings so that society may have a better chance of recognizing and managing harmful forces. </w:t>
+      </w:r>
+      <w:r>
+        <w:rPr>
+          <w:rFonts w:ascii="Times New Roman" w:hAnsi="Times New Roman" w:cs="Times New Roman"/>
+          <w:bCs w:val="0"/>
+          <w:sz w:val="24"/>
+          <w:szCs w:val="24"/>
+        </w:rPr>
+        <w:t>It is usually the case that journalists target and expose entities that would rather not be in the public’s eye. A successful journalist must</w:t>
+      </w:r>
+      <w:r>
+        <w:rPr>
+          <w:rFonts w:ascii="Times New Roman" w:hAnsi="Times New Roman" w:cs="Times New Roman"/>
+          <w:bCs w:val="0"/>
+          <w:sz w:val="24"/>
+          <w:szCs w:val="24"/>
+        </w:rPr>
+        <w:t xml:space="preserve"> sometimes</w:t>
+      </w:r>
+      <w:r>
+        <w:rPr>
+          <w:rFonts w:ascii="Times New Roman" w:hAnsi="Times New Roman" w:cs="Times New Roman"/>
+          <w:bCs w:val="0"/>
+          <w:sz w:val="24"/>
+          <w:szCs w:val="24"/>
+        </w:rPr>
+        <w:t xml:space="preserve"> operate unseen. Surveillance directly counters the need to be unseen. From a journalist’s perspective, Pegasus is a harmful force.</w:t>
       </w:r>
     </w:p>
     <w:p>
@@ -190,31 +574,7 @@
           <w:rPr>
             <w:rStyle w:val="Hyperlink"/>
           </w:rPr>
-          <w:t>https://rm.coe.int/pegas</w:t>
-        </w:r>
-        <w:r>
-          <w:rPr>
-            <w:rStyle w:val="Hyperlink"/>
-          </w:rPr>
-          <w:t>u</w:t>
-        </w:r>
-        <w:r>
-          <w:rPr>
-            <w:rStyle w:val="Hyperlink"/>
-          </w:rPr>
-          <w:t>s-spyware-report</w:t>
-        </w:r>
-        <w:r>
-          <w:rPr>
-            <w:rStyle w:val="Hyperlink"/>
-          </w:rPr>
-          <w:t>-</w:t>
-        </w:r>
-        <w:r>
-          <w:rPr>
-            <w:rStyle w:val="Hyperlink"/>
-          </w:rPr>
-          <w:t>en/1680a6f5d8 (1)</w:t>
+          <w:t>https://rm.coe.int/pegasus-spyware-report-en/1680a6f5d8 (1)</w:t>
         </w:r>
       </w:hyperlink>
     </w:p>
@@ -227,19 +587,7 @@
           <w:rPr>
             <w:rStyle w:val="Hyperlink"/>
           </w:rPr>
-          <w:t>https://securitylab.amnes</w:t>
-        </w:r>
-        <w:r>
-          <w:rPr>
-            <w:rStyle w:val="Hyperlink"/>
-          </w:rPr>
-          <w:t>t</w:t>
-        </w:r>
-        <w:r>
-          <w:rPr>
-            <w:rStyle w:val="Hyperlink"/>
-          </w:rPr>
-          <w:t>y.org/case-study-the-pegasus-project/</w:t>
+          <w:t>https://securitylab.amnesty.org/case-study-the-pegasus-project/</w:t>
         </w:r>
       </w:hyperlink>
     </w:p>
@@ -258,22 +606,97 @@
       </w:r>
     </w:p>
     <w:p>
-      <w:r>
+      <w:pPr>
+        <w:rPr>
+          <w:sz w:val="24"/>
+          <w:szCs w:val="24"/>
+        </w:rPr>
+      </w:pPr>
+      <w:r>
+        <w:rPr>
+          <w:sz w:val="24"/>
+          <w:szCs w:val="24"/>
+        </w:rPr>
         <w:t xml:space="preserve">After </w:t>
       </w:r>
       <w:r>
-        <w:t xml:space="preserve">the NSO group started selling their first version of Pegasus spyware, the company has been on the radar of most journalists. Especially after the Edward Snowden’s whistle blowing in 2013 which exposed a similar system employed by US intelligence agencies, mass surveillance has been a hot topic. And after the assassination of Saudi journalist in Turkey which many thought Pegasus played a role in, the NSO group has been in a very uncomfortable spotlight. The main investigation we will focus on, The Pegasus Project, started after a leaked list of roughly 50,000 </w:t>
-      </w:r>
-      <w:r>
-        <w:t xml:space="preserve">phone numbers fell into the hands of Forbidden Stories, a nonprofit media organization in Paris, and Amnesty International, a global organization with a goal of exposing human rights violations. </w:t>
+        <w:rPr>
+          <w:sz w:val="24"/>
+          <w:szCs w:val="24"/>
+        </w:rPr>
+        <w:t xml:space="preserve">the NSO group started selling their first version of Pegasus, the company has been on the radar of most journalists. Especially after Edward Snowden’s whistle blowing in 2013 which exposed a similar system employed by US intelligence agencies, mass surveillance has been a hot topic. And after the assassination of </w:t>
+      </w:r>
+      <w:r>
+        <w:rPr>
+          <w:sz w:val="24"/>
+          <w:szCs w:val="24"/>
+        </w:rPr>
+        <w:t xml:space="preserve">a </w:t>
+      </w:r>
+      <w:r>
+        <w:rPr>
+          <w:sz w:val="24"/>
+          <w:szCs w:val="24"/>
+        </w:rPr>
+        <w:t xml:space="preserve">Saudi journalist in Turkey which many thought Pegasus played a role in, the NSO group has been in a very uncomfortable spotlight. The main investigation we will focus on, The Pegasus Project, started after a leaked list of roughly 50,000 </w:t>
+      </w:r>
+      <w:r>
+        <w:rPr>
+          <w:sz w:val="24"/>
+          <w:szCs w:val="24"/>
+        </w:rPr>
+        <w:t>phone numbers fell into</w:t>
+      </w:r>
+      <w:r>
+        <w:rPr>
+          <w:sz w:val="24"/>
+          <w:szCs w:val="24"/>
+        </w:rPr>
+        <w:t xml:space="preserve"> the hands of a few prominent media </w:t>
+      </w:r>
+      <w:r>
+        <w:rPr>
+          <w:sz w:val="24"/>
+          <w:szCs w:val="24"/>
+        </w:rPr>
+        <w:t>organization</w:t>
+      </w:r>
+      <w:r>
+        <w:rPr>
+          <w:sz w:val="24"/>
+          <w:szCs w:val="24"/>
+        </w:rPr>
+        <w:t>s.</w:t>
+      </w:r>
+      <w:r>
+        <w:rPr>
+          <w:sz w:val="24"/>
+          <w:szCs w:val="24"/>
+        </w:rPr>
+        <w:t xml:space="preserve"> </w:t>
       </w:r>
       <w:r>
         <w:rPr>
           <w:bCs/>
-        </w:rPr>
-        <w:t>“Forbidden Stories, a Paris-based nonprofit media organisation, and Amnesty International initially had access to the leaked list and shared access with media partners as part of the Pegasus project, a reporting consortium.” (4)</w:t>
-      </w:r>
-      <w:r>
+          <w:sz w:val="24"/>
+          <w:szCs w:val="24"/>
+        </w:rPr>
+        <w:t xml:space="preserve">“Forbidden Stories, a Paris-based nonprofit media organisation, and Amnesty International initially had access to the leaked list and shared access </w:t>
+      </w:r>
+      <w:r>
+        <w:rPr>
+          <w:bCs/>
+          <w:sz w:val="24"/>
+          <w:szCs w:val="24"/>
+        </w:rPr>
+        <w:lastRenderedPageBreak/>
+        <w:t>with media partners as part of the Pegasus project, a reporting consortium.” (4)</w:t>
+      </w:r>
+      <w:r>
+        <w:rPr>
+          <w:sz w:val="24"/>
+          <w:szCs w:val="24"/>
+        </w:rPr>
         <w:t xml:space="preserve"> This list of phone numbers is believed to be a list of targets for the Pegasus spyware. After receiving this list, various media partners of Forbidden Stories and Amnesty International became suspicious of the NSO group. At this point the investigation had begun, and the motivation to figure out exactly what impact Pegasus was having on the world grew quickly. The Pegasus Project consists of 17 media organizations from 10 different countries.</w:t>
       </w:r>
     </w:p>
@@ -282,19 +705,6 @@
         <w:pStyle w:val="ACMRef"/>
       </w:pPr>
       <w:hyperlink r:id="rId10" w:history="1">
-        <w:r>
-          <w:rPr>
-            <w:rStyle w:val="Hyperlink"/>
-          </w:rPr>
-          <w:t>https://www.theguardian.com/world/2021/jul/18/revealed-leak-uncovers-global-abuse-of-cyber-surveillance-weapon-nso-group-pegasus (4)</w:t>
-        </w:r>
-      </w:hyperlink>
-    </w:p>
-    <w:p>
-      <w:pPr>
-        <w:pStyle w:val="ACMRef"/>
-      </w:pPr>
-      <w:hyperlink r:id="rId11" w:history="1">
         <w:r>
           <w:rPr>
             <w:rStyle w:val="Hyperlink"/>
@@ -307,7 +717,7 @@
       <w:pPr>
         <w:pStyle w:val="ACMRef"/>
       </w:pPr>
-      <w:hyperlink r:id="rId12" w:history="1">
+      <w:hyperlink r:id="rId11" w:history="1">
         <w:r>
           <w:rPr>
             <w:rStyle w:val="Hyperlink"/>
@@ -320,7 +730,7 @@
       <w:pPr>
         <w:pStyle w:val="ACMRef"/>
       </w:pPr>
-      <w:hyperlink r:id="rId13" w:history="1">
+      <w:hyperlink r:id="rId12" w:history="1">
         <w:r>
           <w:rPr>
             <w:rStyle w:val="Hyperlink"/>
@@ -345,146 +755,263 @@
     </w:p>
     <w:p>
       <w:pPr>
+        <w:rPr>
+          <w:bCs/>
+          <w:sz w:val="24"/>
+          <w:szCs w:val="24"/>
+        </w:rPr>
+      </w:pPr>
+      <w:r>
+        <w:rPr>
+          <w:sz w:val="24"/>
+          <w:szCs w:val="24"/>
+        </w:rPr>
+        <w:t xml:space="preserve">After the birth of the Pegasus Project, evidence against NSO group started to build as the </w:t>
+      </w:r>
+      <w:r>
+        <w:rPr>
+          <w:sz w:val="24"/>
+          <w:szCs w:val="24"/>
+        </w:rPr>
+        <w:t xml:space="preserve">newly discovered </w:t>
+      </w:r>
+      <w:r>
+        <w:rPr>
+          <w:sz w:val="24"/>
+          <w:szCs w:val="24"/>
+        </w:rPr>
+        <w:t>list of roughly 50,000 phone numbers was analyzed. “</w:t>
+      </w:r>
+      <w:r>
+        <w:rPr>
+          <w:sz w:val="24"/>
+          <w:szCs w:val="24"/>
+        </w:rPr>
+        <w:t>From this list, an analysis of 67 smartphones provided evidence that 37 belonging to journalists, human rights activists, business executives, and two women close to Saudi activists and Washington Post columnist Jamal Khashoggi were targeted or successfully infected by the Pegasus spyware.</w:t>
+      </w:r>
+      <w:r>
+        <w:rPr>
+          <w:sz w:val="24"/>
+          <w:szCs w:val="24"/>
+        </w:rPr>
+        <w:t xml:space="preserve">” (2) These discoveries </w:t>
+      </w:r>
+      <w:r>
+        <w:rPr>
+          <w:sz w:val="24"/>
+          <w:szCs w:val="24"/>
+        </w:rPr>
+        <w:t xml:space="preserve">fueled the fire behind the investigation, but the fate of Khashoggi played an especially impactful role in exposing </w:t>
+      </w:r>
+      <w:r>
+        <w:rPr>
+          <w:sz w:val="24"/>
+          <w:szCs w:val="24"/>
+        </w:rPr>
+        <w:t xml:space="preserve">the </w:t>
+      </w:r>
+      <w:r>
+        <w:rPr>
+          <w:sz w:val="24"/>
+          <w:szCs w:val="24"/>
+        </w:rPr>
+        <w:t>dangers of Pegasus. Before the investigation, in 2018, a close friend of Khashoggi took NSO to court with the belief that their spyware was instrumental in his murder. “</w:t>
+      </w:r>
+      <w:r>
+        <w:rPr>
+          <w:sz w:val="24"/>
+          <w:szCs w:val="24"/>
+        </w:rPr>
+        <w:t>The following year, Amnesty International and even Facebook joined the growing list of plaintiffs after more than 1,500 people’s phones were revealed to have been targeted through a security flaw in the encrypted messaging service WhatsApp.” (3)</w:t>
+      </w:r>
+      <w:r>
+        <w:rPr>
+          <w:sz w:val="24"/>
+          <w:szCs w:val="24"/>
+        </w:rPr>
+        <w:t xml:space="preserve"> </w:t>
+      </w:r>
+      <w:r>
+        <w:rPr>
+          <w:sz w:val="24"/>
+          <w:szCs w:val="24"/>
+        </w:rPr>
+        <w:t xml:space="preserve">Of those prosecuting NSO group, one of the most significant </w:t>
+      </w:r>
+      <w:r>
+        <w:rPr>
+          <w:sz w:val="24"/>
+          <w:szCs w:val="24"/>
+        </w:rPr>
+        <w:t>ruling</w:t>
+      </w:r>
+      <w:r>
+        <w:rPr>
+          <w:sz w:val="24"/>
+          <w:szCs w:val="24"/>
+        </w:rPr>
+        <w:t xml:space="preserve">s was a fine of </w:t>
+      </w:r>
+      <w:r>
+        <w:rPr>
+          <w:sz w:val="24"/>
+          <w:szCs w:val="24"/>
+        </w:rPr>
+        <w:t xml:space="preserve">$167 million to compensate WhatsApp for compromising the platform’s promise of secure communication. This was </w:t>
+      </w:r>
+      <w:r>
+        <w:rPr>
+          <w:sz w:val="24"/>
+          <w:szCs w:val="24"/>
+        </w:rPr>
+        <w:t>reduced</w:t>
+      </w:r>
+      <w:r>
+        <w:rPr>
+          <w:sz w:val="24"/>
+          <w:szCs w:val="24"/>
+        </w:rPr>
+        <w:t xml:space="preserve"> to $4 million alongside the addition of an official ban which prevents NSO group from hacking WhatsApp </w:t>
+      </w:r>
+      <w:r>
+        <w:rPr>
+          <w:sz w:val="24"/>
+          <w:szCs w:val="24"/>
+        </w:rPr>
+        <w:t>to</w:t>
+      </w:r>
+      <w:r>
+        <w:rPr>
+          <w:sz w:val="24"/>
+          <w:szCs w:val="24"/>
+        </w:rPr>
+        <w:t xml:space="preserve"> enable its spyware’s functionality. NSO group’s </w:t>
+      </w:r>
+      <w:r>
+        <w:rPr>
+          <w:sz w:val="24"/>
+          <w:szCs w:val="24"/>
+        </w:rPr>
+        <w:t>ability to function was significantly impaired due to this settlement. “</w:t>
+      </w:r>
+      <w:r>
+        <w:rPr>
+          <w:sz w:val="24"/>
+          <w:szCs w:val="24"/>
+        </w:rPr>
+        <w:t>NSO has previously argued that an injunction preventing it from going after WhatsApp "would put NSO’s entire enterprise at risk" and "force NSO out of business," according to the judgment.</w:t>
+      </w:r>
+      <w:r>
+        <w:rPr>
+          <w:sz w:val="24"/>
+          <w:szCs w:val="24"/>
+        </w:rPr>
+        <w:t>” (8)</w:t>
+      </w:r>
+      <w:r>
+        <w:rPr>
+          <w:sz w:val="24"/>
+          <w:szCs w:val="24"/>
+        </w:rPr>
+        <w:t xml:space="preserve"> In addition to financial </w:t>
+      </w:r>
+      <w:r>
+        <w:rPr>
+          <w:sz w:val="24"/>
+          <w:szCs w:val="24"/>
+        </w:rPr>
+        <w:t>reparations, various actions were taken by global authorities which have the result of restricting NSO group’s ability to operate. In the US, t</w:t>
+      </w:r>
+      <w:r>
+        <w:rPr>
+          <w:sz w:val="24"/>
+          <w:szCs w:val="24"/>
+        </w:rPr>
+        <w:t>he Commerce Department’s Bureau of Industry and Security (BIS)</w:t>
+      </w:r>
+      <w:r>
+        <w:rPr>
+          <w:sz w:val="24"/>
+          <w:szCs w:val="24"/>
+        </w:rPr>
+        <w:t xml:space="preserve"> added NSO to the Entity list, a collection of “</w:t>
+      </w:r>
+      <w:r>
+        <w:rPr>
+          <w:sz w:val="24"/>
+          <w:szCs w:val="24"/>
+        </w:rPr>
+        <w:t>foreign persons, entities, or governments</w:t>
+      </w:r>
+      <w:r>
+        <w:rPr>
+          <w:sz w:val="24"/>
+          <w:szCs w:val="24"/>
+        </w:rPr>
+        <w:t>” (9) subject to trade restrictions.</w:t>
+      </w:r>
+      <w:r>
+        <w:rPr>
+          <w:sz w:val="24"/>
+          <w:szCs w:val="24"/>
+        </w:rPr>
+        <w:t xml:space="preserve"> But there is more. “</w:t>
+      </w:r>
+      <w:r>
+        <w:rPr>
+          <w:sz w:val="24"/>
+          <w:szCs w:val="24"/>
+        </w:rPr>
+        <w:t>On Nov. 3, the U.S. Department of Commerce added NSO to the U.S. sanctions list, an action that caused the company’s recently appointed CEO to resign and NSO’s debts to trade at a fraction of their value—all signs of a company in free-fall.</w:t>
+      </w:r>
+      <w:r>
+        <w:rPr>
+          <w:sz w:val="24"/>
+          <w:szCs w:val="24"/>
+        </w:rPr>
+        <w:t xml:space="preserve">” (10) NSO group has faced significant fallout due to the investigations born out of their spyware’s impacts in the global sphere. </w:t>
+      </w:r>
+      <w:r>
+        <w:rPr>
+          <w:sz w:val="24"/>
+          <w:szCs w:val="24"/>
+        </w:rPr>
+        <w:t>Greater</w:t>
+      </w:r>
+      <w:r>
+        <w:rPr>
+          <w:sz w:val="24"/>
+          <w:szCs w:val="24"/>
+        </w:rPr>
+        <w:t xml:space="preserve"> caution was required during their attempts to enter the cyber arms industry. Aside from the </w:t>
+      </w:r>
+      <w:r>
+        <w:rPr>
+          <w:sz w:val="24"/>
+          <w:szCs w:val="24"/>
+        </w:rPr>
+        <w:t xml:space="preserve">aftermath directly affecting their ability to offer Pegasus on the global spyware market, </w:t>
+      </w:r>
+      <w:r>
+        <w:rPr>
+          <w:sz w:val="24"/>
+          <w:szCs w:val="24"/>
+        </w:rPr>
+        <w:t>NSO group’s ability to operate as a business has been severely impacted by</w:t>
+      </w:r>
+      <w:r>
+        <w:rPr>
+          <w:sz w:val="24"/>
+          <w:szCs w:val="24"/>
+        </w:rPr>
+        <w:t xml:space="preserve"> the consequences of Pegasus-related investigations.</w:t>
+      </w:r>
+    </w:p>
+    <w:p>
+      <w:pPr>
         <w:pStyle w:val="ACMRef"/>
-        <w:ind w:firstLine="432"/>
-        <w:rPr>
-          <w:rFonts w:ascii="Times New Roman" w:hAnsi="Times New Roman" w:cs="Times New Roman"/>
-          <w:bCs w:val="0"/>
-          <w:sz w:val="18"/>
-        </w:rPr>
-      </w:pPr>
-      <w:r>
-        <w:rPr>
-          <w:rFonts w:ascii="Times New Roman" w:hAnsi="Times New Roman" w:cs="Times New Roman"/>
-          <w:bCs w:val="0"/>
-          <w:sz w:val="18"/>
-        </w:rPr>
-        <w:t>Describe the response / fallout to the investigation.</w:t>
-      </w:r>
-    </w:p>
-    <w:p>
-      <w:pPr>
-        <w:pStyle w:val="ACMRef"/>
-        <w:numPr>
-          <w:ilvl w:val="0"/>
-          <w:numId w:val="8"/>
-        </w:numPr>
-        <w:rPr>
-          <w:rFonts w:ascii="Times New Roman" w:hAnsi="Times New Roman" w:cs="Times New Roman"/>
-          <w:bCs w:val="0"/>
-          <w:sz w:val="18"/>
-        </w:rPr>
-      </w:pPr>
-      <w:r>
-        <w:rPr>
-          <w:rFonts w:ascii="Times New Roman" w:hAnsi="Times New Roman" w:cs="Times New Roman"/>
-          <w:bCs w:val="0"/>
-          <w:sz w:val="18"/>
-        </w:rPr>
-        <w:t>QUOTE: “In December 2018, Omar Abdulaziz, the friend of Jamal Khashoggi, took NSO to court in Israel. The following year, Amnesty International and even Facebook joined the growing list of plaintiffs after more than 1,500 people’s phones were revealed to have been targeted through a security flaw in the encrypted messaging service WhatsApp.” (3)</w:t>
-      </w:r>
-    </w:p>
-    <w:p>
-      <w:pPr>
-        <w:pStyle w:val="ACMRef"/>
-        <w:numPr>
-          <w:ilvl w:val="0"/>
-          <w:numId w:val="8"/>
-        </w:numPr>
-        <w:rPr>
-          <w:rFonts w:ascii="Times New Roman" w:hAnsi="Times New Roman" w:cs="Times New Roman"/>
-          <w:bCs w:val="0"/>
-          <w:sz w:val="18"/>
-        </w:rPr>
-      </w:pPr>
-      <w:r>
-        <w:rPr>
-          <w:rFonts w:ascii="Times New Roman" w:hAnsi="Times New Roman" w:cs="Times New Roman"/>
-          <w:bCs w:val="0"/>
-          <w:sz w:val="18"/>
-        </w:rPr>
-        <w:t xml:space="preserve">QUOTE: “From this list, an analysis of 67 smartphones provided evidence that 37 belonging to journalists, human rights activists, business executives, and two women close to Saudi activists and Washington Post columnist Jamal Khashoggi were targeted or </w:t>
-      </w:r>
-      <w:r>
-        <w:rPr>
-          <w:rFonts w:ascii="Times New Roman" w:hAnsi="Times New Roman" w:cs="Times New Roman"/>
-          <w:bCs w:val="0"/>
-          <w:sz w:val="18"/>
-        </w:rPr>
-        <w:lastRenderedPageBreak/>
-        <w:t>successfully infected by the Pegasus spyware. The tests for the remaining 30 were inconclusive either because phones were replaced or because Android devises do not log the needed information for the investigation.” (2)</w:t>
-      </w:r>
-    </w:p>
-    <w:p>
-      <w:pPr>
-        <w:pStyle w:val="ACMRef"/>
-        <w:numPr>
-          <w:ilvl w:val="0"/>
-          <w:numId w:val="8"/>
-        </w:numPr>
-        <w:rPr>
-          <w:rFonts w:ascii="Times New Roman" w:hAnsi="Times New Roman" w:cs="Times New Roman"/>
-          <w:bCs w:val="0"/>
-          <w:sz w:val="18"/>
-        </w:rPr>
-      </w:pPr>
-      <w:r>
-        <w:rPr>
-          <w:rFonts w:ascii="Times New Roman" w:hAnsi="Times New Roman" w:cs="Times New Roman"/>
-          <w:bCs w:val="0"/>
-          <w:sz w:val="18"/>
-        </w:rPr>
-        <w:t>QUOTE: “The NSO hacking revelation, while only one piece of the puzzle, has perhaps been the most prominent due to the scale and scope of the violation as well as the </w:t>
-      </w:r>
-      <w:hyperlink r:id="rId14" w:history="1">
-        <w:r>
-          <w:rPr>
-            <w:rFonts w:ascii="Times New Roman" w:hAnsi="Times New Roman" w:cs="Times New Roman"/>
-            <w:bCs w:val="0"/>
-            <w:sz w:val="18"/>
-          </w:rPr>
-          <w:t>level of individuals</w:t>
-        </w:r>
-      </w:hyperlink>
-      <w:r>
-        <w:rPr>
-          <w:rFonts w:ascii="Times New Roman" w:hAnsi="Times New Roman" w:cs="Times New Roman"/>
-          <w:bCs w:val="0"/>
-          <w:sz w:val="18"/>
-        </w:rPr>
-        <w:t> targeted by the Pegasus software. These included French President Emmanuel Macron, the presidents of Iraq and South Africa, Qatar’s royal family members, Morocco’s King Mohammed VI, the current prime ministers of Pakistan, Egypt, and Morocco, and seven former prime ministers. Khashoggi’s killing has gained international prominence for its brutal and lawless nature, but it also has shed light on the role of tech firms in transnational repression, as many of his family members and friends were targeted by Pegasus or hacked before and after his assassination.” (2)</w:t>
-      </w:r>
-    </w:p>
-    <w:p>
-      <w:pPr>
-        <w:pStyle w:val="ACMRef"/>
-      </w:pPr>
-      <w:hyperlink r:id="rId15" w:history="1">
-        <w:r>
-          <w:rPr>
-            <w:rStyle w:val="Hyperlink"/>
-          </w:rPr>
-          <w:t>https://forbiddenstories.org/the-rise</w:t>
-        </w:r>
-        <w:r>
-          <w:rPr>
-            <w:rStyle w:val="Hyperlink"/>
-          </w:rPr>
-          <w:t>-</w:t>
-        </w:r>
-        <w:r>
-          <w:rPr>
-            <w:rStyle w:val="Hyperlink"/>
-          </w:rPr>
-          <w:t>and-fall-of-nso-group/ (3)</w:t>
-        </w:r>
-      </w:hyperlink>
-    </w:p>
-    <w:p>
-      <w:pPr>
-        <w:pStyle w:val="ACMRef"/>
-      </w:pPr>
-      <w:hyperlink r:id="rId16" w:history="1">
+      </w:pPr>
+      <w:hyperlink r:id="rId13" w:history="1">
         <w:r>
           <w:rPr>
             <w:rStyle w:val="Hyperlink"/>
@@ -497,7 +1024,7 @@
       <w:pPr>
         <w:pStyle w:val="ACMRef"/>
       </w:pPr>
-      <w:hyperlink r:id="rId17" w:history="1">
+      <w:hyperlink r:id="rId14" w:history="1">
         <w:r>
           <w:rPr>
             <w:rStyle w:val="Hyperlink"/>
@@ -592,7 +1119,11 @@
         <w:t>“</w:t>
       </w:r>
       <w:r>
-        <w:t>Citizen Lab was able to recover these Pegasus exploits from an iPhone and therefore this analysis covers NSO's capabilities against iPhone. We are aware that NSO sells similar zero-click capabilities which target Android devices</w:t>
+        <w:t xml:space="preserve">Citizen Lab was able to recover these Pegasus exploits from an iPhone and therefore this analysis </w:t>
+      </w:r>
+      <w:r>
+        <w:lastRenderedPageBreak/>
+        <w:t>covers NSO's capabilities against iPhone. We are aware that NSO sells similar zero-click capabilities which target Android devices</w:t>
       </w:r>
       <w:r>
         <w:t>”. (5)</w:t>
@@ -659,7 +1190,7 @@
           <w:szCs w:val="20"/>
           <w:lang w:eastAsia="en-US"/>
         </w:rPr>
-        <w:t xml:space="preserve">“The initial entry point for Pegasus on iPhone is iMessage. This means that a victim can be targeted just using their </w:t>
+        <w:t>“The initial entry point for Pegasus on iPhone is iMessage. This means that a victim can be targeted just using their phone number or AppleID username.” (5)</w:t>
       </w:r>
       <w:r>
         <w:rPr>
@@ -667,7 +1198,7 @@
           <w:szCs w:val="20"/>
           <w:lang w:eastAsia="en-US"/>
         </w:rPr>
-        <w:t>phone number or AppleID username.” (5)</w:t>
+        <w:t xml:space="preserve"> The FORCEDENTRY exploit starts by sending a gif. Well, not exactly. iMessage has native support for sending gifs and for optimization purposes is pre-rendering those images before displaying them to users. </w:t>
       </w:r>
       <w:r>
         <w:rPr>
@@ -675,17 +1206,9 @@
           <w:szCs w:val="20"/>
           <w:lang w:eastAsia="en-US"/>
         </w:rPr>
-        <w:t xml:space="preserve"> The FORCEDENTRY exploit starts by sending a gif. Well, not exactly. iMessage has native support for sending gifs and for optimization purposes is pre-rendering those images before displaying them to users. </w:t>
-      </w:r>
-      <w:r>
-        <w:rPr>
-          <w:rFonts w:ascii="Times New Roman" w:hAnsi="Times New Roman" w:cs="Times New Roman"/>
-          <w:szCs w:val="20"/>
-          <w:lang w:eastAsia="en-US"/>
-        </w:rPr>
         <w:t>“Apple wanted to make those GIFs loop endlessly rather than only play once, so very early on in the </w:t>
       </w:r>
-      <w:hyperlink r:id="rId18" w:history="1">
+      <w:hyperlink r:id="rId15" w:history="1">
         <w:r>
           <w:rPr>
             <w:rFonts w:ascii="Times New Roman" w:hAnsi="Times New Roman" w:cs="Times New Roman"/>
@@ -725,6 +1248,7 @@
       <w:r>
         <w:rPr>
           <w:rFonts w:ascii="Times New Roman" w:hAnsi="Times New Roman" w:cs="Times New Roman"/>
+          <w:noProof/>
           <w:szCs w:val="20"/>
           <w:lang w:eastAsia="en-US"/>
         </w:rPr>
@@ -744,7 +1268,7 @@
                     <pic:cNvPicPr/>
                   </pic:nvPicPr>
                   <pic:blipFill>
-                    <a:blip r:embed="rId19"/>
+                    <a:blip r:embed="rId16"/>
                     <a:stretch>
                       <a:fillRect/>
                     </a:stretch>
@@ -883,7 +1407,7 @@
         </w:rPr>
         <w:t>“The ImageIO library, </w:t>
       </w:r>
-      <w:hyperlink r:id="rId20" w:history="1">
+      <w:hyperlink r:id="rId17" w:history="1">
         <w:r>
           <w:rPr>
             <w:rFonts w:ascii="Times New Roman" w:hAnsi="Times New Roman" w:cs="Times New Roman"/>
@@ -998,7 +1522,7 @@
           <w:szCs w:val="20"/>
           <w:lang w:eastAsia="en-US"/>
         </w:rPr>
-        <w:t>their JBIG2 parsing logic used the open source Xpdf toolkit as part of their implementation.</w:t>
+        <w:t xml:space="preserve">their JBIG2 parsing logic used the open source Xpdf toolkit as part of their </w:t>
       </w:r>
       <w:r>
         <w:rPr>
@@ -1006,6 +1530,14 @@
           <w:szCs w:val="20"/>
           <w:lang w:eastAsia="en-US"/>
         </w:rPr>
+        <w:t>implementation.</w:t>
+      </w:r>
+      <w:r>
+        <w:rPr>
+          <w:rFonts w:ascii="Times New Roman" w:hAnsi="Times New Roman" w:cs="Times New Roman"/>
+          <w:szCs w:val="20"/>
+          <w:lang w:eastAsia="en-US"/>
+        </w:rPr>
         <w:t xml:space="preserve"> JBIG2 contains vulnerability and supplies the tools that NSO uses to embed their spyware into a device. NSO used the extreme compression capabilities of JBIG2 which are supported by two main features.</w:t>
       </w:r>
     </w:p>
@@ -1049,7 +1581,6 @@
     </w:p>
     <w:p>
       <w:r>
-        <w:lastRenderedPageBreak/>
         <w:t xml:space="preserve"> </w:t>
       </w:r>
       <w:r>
@@ -1074,7 +1605,7 @@
                     </pic:cNvPicPr>
                   </pic:nvPicPr>
                   <pic:blipFill>
-                    <a:blip r:embed="rId21">
+                    <a:blip r:embed="rId18">
                       <a:extLst>
                         <a:ext uri="{28A0092B-C50C-407E-A947-70E740481C1C}">
                           <a14:useLocalDpi xmlns:a14="http://schemas.microsoft.com/office/drawing/2010/main" val="0"/>
@@ -1177,7 +1708,7 @@
                     </pic:cNvPicPr>
                   </pic:nvPicPr>
                   <pic:blipFill>
-                    <a:blip r:embed="rId22">
+                    <a:blip r:embed="rId19">
                       <a:extLst>
                         <a:ext uri="{28A0092B-C50C-407E-A947-70E740481C1C}">
                           <a14:useLocalDpi xmlns:a14="http://schemas.microsoft.com/office/drawing/2010/main" val="0"/>
@@ -1221,7 +1752,11 @@
         <w:t>“</w:t>
       </w:r>
       <w:r>
-        <w:t>Rather than completely encoding the entire difference in one go, it can be done in steps, with each iteration using a logical operator (one of AND, OR, XOR or XNOR) to set, clear or flip bits. Each successive refinement step brings the rendered output closer to the original and this allows a level of control over the "lossiness" of the compression. The implementation of these refinement coding steps is very flexible and they are also able to "read" values already present on the output canvas.</w:t>
+        <w:t xml:space="preserve">Rather than completely encoding the entire difference in one go, it can be done in steps, with each iteration using a logical operator (one of AND, OR, </w:t>
+      </w:r>
+      <w:r>
+        <w:lastRenderedPageBreak/>
+        <w:t>XOR or XNOR) to set, clear or flip bits. Each successive refinement step brings the rendered output closer to the original and this allows a level of control over the "lossiness" of the compression. The implementation of these refinement coding steps is very flexible and they are also able to "read" values already present on the output canvas.</w:t>
       </w:r>
       <w:r>
         <w:t xml:space="preserve">” (5) </w:t>
@@ -1261,10 +1796,7 @@
         <w:t>r</w:t>
       </w:r>
       <w:r>
-        <w:t xml:space="preserve"> overflow to occur within Apple’s PDF parser implementation. </w:t>
-      </w:r>
-      <w:r>
-        <w:t xml:space="preserve">NSO used this overflow to set the value of a local variable to something small and exact. This variable is later used to allocate a buffer </w:t>
+        <w:t xml:space="preserve"> overflow to occur within Apple’s PDF parser implementation. NSO used this overflow to set the value of a local variable to something small and exact. This variable is later used to allocate a buffer </w:t>
       </w:r>
       <w:r>
         <w:t>on the heap. Data is then written to this undersized buffer later in the implementation.</w:t>
@@ -1402,7 +1934,6 @@
         <w:rPr>
           <w:noProof/>
         </w:rPr>
-        <w:lastRenderedPageBreak/>
         <w:drawing>
           <wp:inline distT="0" distB="0" distL="0" distR="0" wp14:anchorId="0B6BB4AF" wp14:editId="0D6CA0D5">
             <wp:extent cx="3049270" cy="2289175"/>
@@ -1421,7 +1952,7 @@
                     </pic:cNvPicPr>
                   </pic:nvPicPr>
                   <pic:blipFill>
-                    <a:blip r:embed="rId23">
+                    <a:blip r:embed="rId20">
                       <a:extLst>
                         <a:ext uri="{28A0092B-C50C-407E-A947-70E740481C1C}">
                           <a14:useLocalDpi xmlns:a14="http://schemas.microsoft.com/office/drawing/2010/main" val="0"/>
@@ -1486,7 +2017,7 @@
                     </pic:cNvPicPr>
                   </pic:nvPicPr>
                   <pic:blipFill>
-                    <a:blip r:embed="rId24" cstate="print">
+                    <a:blip r:embed="rId21" cstate="print">
                       <a:extLst>
                         <a:ext uri="{28A0092B-C50C-407E-A947-70E740481C1C}">
                           <a14:useLocalDpi xmlns:a14="http://schemas.microsoft.com/office/drawing/2010/main" val="0"/>
@@ -1560,6 +2091,7 @@
         <w:rPr>
           <w:noProof/>
         </w:rPr>
+        <w:lastRenderedPageBreak/>
         <w:drawing>
           <wp:inline distT="0" distB="0" distL="0" distR="0" wp14:anchorId="1095E53E" wp14:editId="341FCD03">
             <wp:extent cx="3049270" cy="3077210"/>
@@ -1578,7 +2110,7 @@
                     </pic:cNvPicPr>
                   </pic:nvPicPr>
                   <pic:blipFill>
-                    <a:blip r:embed="rId25">
+                    <a:blip r:embed="rId22">
                       <a:extLst>
                         <a:ext uri="{28A0092B-C50C-407E-A947-70E740481C1C}">
                           <a14:useLocalDpi xmlns:a14="http://schemas.microsoft.com/office/drawing/2010/main" val="0"/>
@@ -1656,7 +2188,7 @@
                     </pic:cNvPicPr>
                   </pic:nvPicPr>
                   <pic:blipFill>
-                    <a:blip r:embed="rId26">
+                    <a:blip r:embed="rId23">
                       <a:extLst>
                         <a:ext uri="{28A0092B-C50C-407E-A947-70E740481C1C}">
                           <a14:useLocalDpi xmlns:a14="http://schemas.microsoft.com/office/drawing/2010/main" val="0"/>
@@ -1691,7 +2223,6 @@
         <w:t xml:space="preserve">NSO uses these operators and the unbounded canvas generated by previous corruption to simulate a logical environment in which to house computational functionality. At this point, the door is open, </w:t>
       </w:r>
       <w:r>
-        <w:lastRenderedPageBreak/>
         <w:t xml:space="preserve">NSO just needs to </w:t>
       </w:r>
       <w:r>
@@ -1725,7 +2256,7 @@
       <w:pPr>
         <w:pStyle w:val="ACMRef"/>
       </w:pPr>
-      <w:hyperlink r:id="rId27" w:history="1">
+      <w:hyperlink r:id="rId24" w:history="1">
         <w:r>
           <w:rPr>
             <w:rStyle w:val="Hyperlink"/>
@@ -1738,7 +2269,7 @@
       <w:pPr>
         <w:pStyle w:val="ACMRef"/>
       </w:pPr>
-      <w:hyperlink r:id="rId28" w:history="1">
+      <w:hyperlink r:id="rId25" w:history="1">
         <w:r>
           <w:rPr>
             <w:rStyle w:val="Hyperlink"/>
@@ -1751,7 +2282,7 @@
       <w:pPr>
         <w:pStyle w:val="ACMRef"/>
       </w:pPr>
-      <w:hyperlink r:id="rId29" w:history="1">
+      <w:hyperlink r:id="rId26" w:history="1">
         <w:r>
           <w:rPr>
             <w:rStyle w:val="Hyperlink"/>
@@ -1764,24 +2295,12 @@
       <w:pPr>
         <w:pStyle w:val="ACMRef"/>
       </w:pPr>
-      <w:hyperlink r:id="rId30" w:history="1">
+      <w:hyperlink r:id="rId27" w:history="1">
         <w:r>
           <w:rPr>
             <w:rStyle w:val="Hyperlink"/>
           </w:rPr>
-          <w:t>https://www.ge</w:t>
-        </w:r>
-        <w:r>
-          <w:rPr>
-            <w:rStyle w:val="Hyperlink"/>
-          </w:rPr>
-          <w:t>e</w:t>
-        </w:r>
-        <w:r>
-          <w:rPr>
-            <w:rStyle w:val="Hyperlink"/>
-          </w:rPr>
-          <w:t>ksforgeeks.org/blogs/what-is-pegasus-spyware-and-how-it-works/</w:t>
+          <w:t>https://www.geeksforgeeks.org/blogs/what-is-pegasus-spyware-and-how-it-works/</w:t>
         </w:r>
       </w:hyperlink>
     </w:p>
@@ -1789,7 +2308,7 @@
       <w:pPr>
         <w:pStyle w:val="ACMRef"/>
       </w:pPr>
-      <w:hyperlink r:id="rId31" w:history="1">
+      <w:hyperlink r:id="rId28" w:history="1">
         <w:r>
           <w:rPr>
             <w:rStyle w:val="Hyperlink"/>
@@ -1802,24 +2321,12 @@
       <w:pPr>
         <w:pStyle w:val="ACMRef"/>
       </w:pPr>
-      <w:hyperlink r:id="rId32" w:history="1">
+      <w:hyperlink r:id="rId29" w:history="1">
         <w:r>
           <w:rPr>
             <w:rStyle w:val="Hyperlink"/>
           </w:rPr>
-          <w:t>https://www.occrp.org/en/pro</w:t>
-        </w:r>
-        <w:r>
-          <w:rPr>
-            <w:rStyle w:val="Hyperlink"/>
-          </w:rPr>
-          <w:t>j</w:t>
-        </w:r>
-        <w:r>
-          <w:rPr>
-            <w:rStyle w:val="Hyperlink"/>
-          </w:rPr>
-          <w:t>ect/the-pegasus-project/how-does-pegasus-work</w:t>
+          <w:t>https://www.occrp.org/en/project/the-pegasus-project/how-does-pegasus-work</w:t>
         </w:r>
       </w:hyperlink>
     </w:p>
@@ -1837,6 +2344,72 @@
         <w:t>ethical analysis and conclusion:</w:t>
       </w:r>
     </w:p>
+    <w:p>
+      <w:pPr>
+        <w:pStyle w:val="Heading3"/>
+      </w:pPr>
+      <w:r>
+        <w:t>Frame of Reference</w:t>
+      </w:r>
+    </w:p>
+    <w:p>
+      <w:r>
+        <w:t xml:space="preserve">Ethics exist within reference frames. They are not objective. </w:t>
+      </w:r>
+      <w:r>
+        <w:t xml:space="preserve">To form an ethical framework, we must decide what we value. This is not a trivial question and here is an example of why; If you decide that you value consistency, then </w:t>
+      </w:r>
+      <w:r>
+        <w:t>all</w:t>
+      </w:r>
+      <w:r>
+        <w:t xml:space="preserve"> the “workable” ethical frameworks we have discussed in class would be considered valuable and useful for helping to analyze the ethics of many situations. But </w:t>
+      </w:r>
+      <w:r>
+        <w:t>let’s</w:t>
+      </w:r>
+      <w:r>
+        <w:t xml:space="preserve"> say you don’t value consistency. </w:t>
+      </w:r>
+      <w:r>
+        <w:t xml:space="preserve">Let’s say you and/or your surrounding society values inconsistency, chaos, and observing each moment without predisposition. In this case, </w:t>
+      </w:r>
+      <w:proofErr w:type="gramStart"/>
+      <w:r>
+        <w:t>all of</w:t>
+      </w:r>
+      <w:proofErr w:type="gramEnd"/>
+      <w:r>
+        <w:t xml:space="preserve"> the “workable” ethical frameworks we have covered would be considered useless, and harmful because the goal of a “workable” ethical framework is to be reusable because of its consistency. For this reason, I have decided to analyze the question at the core of this paper from two specific perspectives. </w:t>
+      </w:r>
+    </w:p>
+    <w:p>
+      <w:pPr>
+        <w:pStyle w:val="Heading3"/>
+      </w:pPr>
+      <w:r>
+        <w:t>Might Makes Right</w:t>
+      </w:r>
+    </w:p>
+    <w:p/>
+    <w:p>
+      <w:pPr>
+        <w:pStyle w:val="Heading3"/>
+      </w:pPr>
+      <w:r>
+        <w:t>Protect the Weak</w:t>
+      </w:r>
+    </w:p>
+    <w:p>
+      <w:pPr>
+        <w:pStyle w:val="Heading3"/>
+      </w:pPr>
+      <w:r>
+        <w:t xml:space="preserve">Conclusion </w:t>
+      </w:r>
+    </w:p>
+    <w:p/>
+    <w:p/>
     <w:p>
       <w:pPr>
         <w:pStyle w:val="ACMRef"/>
@@ -1875,6 +2448,7 @@
           <w:bCs w:val="0"/>
           <w:sz w:val="18"/>
         </w:rPr>
+        <w:lastRenderedPageBreak/>
         <w:t>QUOTE: “transnational repression, which is the practice of authoritarian governments targeting dissidents, journalists and activists outside of their sovereign borders to silence dissent.” (5)</w:t>
       </w:r>
     </w:p>
@@ -1926,7 +2500,7 @@
       <w:pPr>
         <w:pStyle w:val="ACMRef"/>
       </w:pPr>
-      <w:hyperlink r:id="rId33" w:history="1">
+      <w:hyperlink r:id="rId30" w:history="1">
         <w:r>
           <w:rPr>
             <w:rStyle w:val="Hyperlink"/>
@@ -1939,7 +2513,7 @@
       <w:pPr>
         <w:pStyle w:val="ACMRef"/>
       </w:pPr>
-      <w:hyperlink r:id="rId34" w:history="1">
+      <w:hyperlink r:id="rId31" w:history="1">
         <w:r>
           <w:rPr>
             <w:rStyle w:val="Hyperlink"/>
@@ -1952,7 +2526,7 @@
       <w:pPr>
         <w:pStyle w:val="ACMRef"/>
       </w:pPr>
-      <w:hyperlink r:id="rId35" w:history="1">
+      <w:hyperlink r:id="rId32" w:history="1">
         <w:r>
           <w:rPr>
             <w:rStyle w:val="Hyperlink"/>
@@ -1991,181 +2565,173 @@
           <w:szCs w:val="20"/>
           <w:lang w:eastAsia="en-US"/>
         </w:rPr>
-        <w:t xml:space="preserve">Is there more information that you can provide, as a practitioner in computer science, towards the ethical </w:t>
-      </w:r>
-      <w:r>
+        <w:t>Is there more information that you can provide, as a practitioner in computer science, towards the ethical responsibilities of the technical parties involved in this series of events?</w:t>
+      </w:r>
+    </w:p>
+    <w:p>
+      <w:pPr>
+        <w:pStyle w:val="Para"/>
+        <w:ind w:firstLine="360"/>
         <w:rPr>
           <w:rFonts w:ascii="Times New Roman" w:eastAsia="Times New Roman" w:hAnsi="Times New Roman" w:cs="Times New Roman"/>
           <w:szCs w:val="20"/>
           <w:lang w:eastAsia="en-US"/>
         </w:rPr>
-        <w:t>responsibilities of the technical parties involved in this series of events?</w:t>
-      </w:r>
-    </w:p>
-    <w:p>
-      <w:pPr>
-        <w:pStyle w:val="Para"/>
-        <w:ind w:firstLine="360"/>
+      </w:pPr>
+      <w:r>
         <w:rPr>
           <w:rFonts w:ascii="Times New Roman" w:eastAsia="Times New Roman" w:hAnsi="Times New Roman" w:cs="Times New Roman"/>
           <w:szCs w:val="20"/>
           <w:lang w:eastAsia="en-US"/>
         </w:rPr>
-      </w:pPr>
-      <w:r>
+        <w:t>• How have these events shaped your understanding of what it means to be a “successful business/professional in computing”?</w:t>
+      </w:r>
+    </w:p>
+    <w:p>
+      <w:pPr>
+        <w:pStyle w:val="Para"/>
+        <w:ind w:firstLine="360"/>
         <w:rPr>
           <w:rFonts w:ascii="Times New Roman" w:eastAsia="Times New Roman" w:hAnsi="Times New Roman" w:cs="Times New Roman"/>
           <w:szCs w:val="20"/>
           <w:lang w:eastAsia="en-US"/>
         </w:rPr>
-        <w:t>• How have these events shaped your understanding of what it means to be a “successful business/professional in computing”?</w:t>
-      </w:r>
-    </w:p>
-    <w:p>
-      <w:pPr>
-        <w:pStyle w:val="Para"/>
-        <w:ind w:firstLine="360"/>
+      </w:pPr>
+      <w:r>
         <w:rPr>
           <w:rFonts w:ascii="Times New Roman" w:eastAsia="Times New Roman" w:hAnsi="Times New Roman" w:cs="Times New Roman"/>
           <w:szCs w:val="20"/>
           <w:lang w:eastAsia="en-US"/>
         </w:rPr>
-      </w:pPr>
-      <w:r>
+        <w:t>• Are there any significant takeaways that you can apply to your projects/experience in DigiPen?</w:t>
+      </w:r>
+    </w:p>
+    <w:p>
+      <w:pPr>
+        <w:pStyle w:val="Para"/>
+        <w:ind w:firstLine="0"/>
         <w:rPr>
           <w:rFonts w:ascii="Times New Roman" w:eastAsia="Times New Roman" w:hAnsi="Times New Roman" w:cs="Times New Roman"/>
           <w:szCs w:val="20"/>
           <w:lang w:eastAsia="en-US"/>
         </w:rPr>
-        <w:t>• Are there any significant takeaways that you can apply to your projects/experience in DigiPen?</w:t>
-      </w:r>
-    </w:p>
-    <w:p>
-      <w:pPr>
-        <w:pStyle w:val="Para"/>
-        <w:ind w:firstLine="0"/>
+      </w:pPr>
+      <w:r>
         <w:rPr>
           <w:rFonts w:ascii="Times New Roman" w:eastAsia="Times New Roman" w:hAnsi="Times New Roman" w:cs="Times New Roman"/>
           <w:szCs w:val="20"/>
           <w:lang w:eastAsia="en-US"/>
         </w:rPr>
-      </w:pPr>
-      <w:r>
+        <w:t>Use one or more of the following Workable Ethical Theories to provide your reasoning. You may combine concepts / theorems / frameworks from multiple theories to support your argument (you do not need to use EVERY framework):</w:t>
+      </w:r>
+    </w:p>
+    <w:p>
+      <w:pPr>
+        <w:pStyle w:val="Para"/>
+        <w:ind w:firstLine="360"/>
         <w:rPr>
           <w:rFonts w:ascii="Times New Roman" w:eastAsia="Times New Roman" w:hAnsi="Times New Roman" w:cs="Times New Roman"/>
           <w:szCs w:val="20"/>
           <w:lang w:eastAsia="en-US"/>
         </w:rPr>
-        <w:t>Use one or more of the following Workable Ethical Theories to provide your reasoning. You may combine concepts / theorems / frameworks from multiple theories to support your argument (you do not need to use EVERY framework):</w:t>
-      </w:r>
-    </w:p>
-    <w:p>
-      <w:pPr>
-        <w:pStyle w:val="Para"/>
-        <w:ind w:firstLine="360"/>
+      </w:pPr>
+      <w:r>
         <w:rPr>
           <w:rFonts w:ascii="Times New Roman" w:eastAsia="Times New Roman" w:hAnsi="Times New Roman" w:cs="Times New Roman"/>
           <w:szCs w:val="20"/>
           <w:lang w:eastAsia="en-US"/>
         </w:rPr>
-      </w:pPr>
-      <w:r>
+        <w:t>• Kantianism</w:t>
+      </w:r>
+    </w:p>
+    <w:p>
+      <w:pPr>
+        <w:pStyle w:val="Para"/>
+        <w:ind w:firstLine="360"/>
         <w:rPr>
           <w:rFonts w:ascii="Times New Roman" w:eastAsia="Times New Roman" w:hAnsi="Times New Roman" w:cs="Times New Roman"/>
           <w:szCs w:val="20"/>
           <w:lang w:eastAsia="en-US"/>
         </w:rPr>
-        <w:t>• Kantianism</w:t>
-      </w:r>
-    </w:p>
-    <w:p>
-      <w:pPr>
-        <w:pStyle w:val="Para"/>
-        <w:ind w:firstLine="360"/>
+      </w:pPr>
+      <w:r>
         <w:rPr>
           <w:rFonts w:ascii="Times New Roman" w:eastAsia="Times New Roman" w:hAnsi="Times New Roman" w:cs="Times New Roman"/>
           <w:szCs w:val="20"/>
           <w:lang w:eastAsia="en-US"/>
         </w:rPr>
-      </w:pPr>
-      <w:r>
+        <w:t>• Act Utilitarianism</w:t>
+      </w:r>
+    </w:p>
+    <w:p>
+      <w:pPr>
+        <w:pStyle w:val="Para"/>
+        <w:ind w:firstLine="360"/>
         <w:rPr>
           <w:rFonts w:ascii="Times New Roman" w:eastAsia="Times New Roman" w:hAnsi="Times New Roman" w:cs="Times New Roman"/>
           <w:szCs w:val="20"/>
           <w:lang w:eastAsia="en-US"/>
         </w:rPr>
-        <w:t>• Act Utilitarianism</w:t>
-      </w:r>
-    </w:p>
-    <w:p>
-      <w:pPr>
-        <w:pStyle w:val="Para"/>
-        <w:ind w:firstLine="360"/>
+      </w:pPr>
+      <w:r>
         <w:rPr>
           <w:rFonts w:ascii="Times New Roman" w:eastAsia="Times New Roman" w:hAnsi="Times New Roman" w:cs="Times New Roman"/>
           <w:szCs w:val="20"/>
           <w:lang w:eastAsia="en-US"/>
         </w:rPr>
-      </w:pPr>
-      <w:r>
+        <w:t>• Virtue Ethics</w:t>
+      </w:r>
+    </w:p>
+    <w:p>
+      <w:pPr>
+        <w:pStyle w:val="Para"/>
+        <w:ind w:firstLine="360"/>
         <w:rPr>
           <w:rFonts w:ascii="Times New Roman" w:eastAsia="Times New Roman" w:hAnsi="Times New Roman" w:cs="Times New Roman"/>
           <w:szCs w:val="20"/>
           <w:lang w:eastAsia="en-US"/>
         </w:rPr>
-        <w:t>• Virtue Ethics</w:t>
-      </w:r>
-    </w:p>
-    <w:p>
-      <w:pPr>
-        <w:pStyle w:val="Para"/>
-        <w:ind w:firstLine="360"/>
+      </w:pPr>
+      <w:r>
         <w:rPr>
           <w:rFonts w:ascii="Times New Roman" w:eastAsia="Times New Roman" w:hAnsi="Times New Roman" w:cs="Times New Roman"/>
           <w:szCs w:val="20"/>
           <w:lang w:eastAsia="en-US"/>
         </w:rPr>
-      </w:pPr>
-      <w:r>
+        <w:t>• Social Contract Theory</w:t>
+      </w:r>
+    </w:p>
+    <w:p>
+      <w:pPr>
+        <w:pStyle w:val="Para"/>
+        <w:ind w:firstLine="0"/>
         <w:rPr>
           <w:rFonts w:ascii="Times New Roman" w:eastAsia="Times New Roman" w:hAnsi="Times New Roman" w:cs="Times New Roman"/>
           <w:szCs w:val="20"/>
           <w:lang w:eastAsia="en-US"/>
         </w:rPr>
-        <w:t>• Social Contract Theory</w:t>
-      </w:r>
-    </w:p>
-    <w:p>
-      <w:pPr>
-        <w:pStyle w:val="Para"/>
-        <w:ind w:firstLine="0"/>
+      </w:pPr>
+      <w:r>
         <w:rPr>
           <w:rFonts w:ascii="Times New Roman" w:eastAsia="Times New Roman" w:hAnsi="Times New Roman" w:cs="Times New Roman"/>
           <w:szCs w:val="20"/>
           <w:lang w:eastAsia="en-US"/>
         </w:rPr>
-      </w:pPr>
+        <w:t xml:space="preserve">Your report should be submitted using the ACM template, and be 6-8 pages in length (6 pages minimum), excluding the list of references. You are required to search for reliable sources and cite them with appropriate reference </w:t>
+      </w:r>
+      <w:r>
+        <w:rPr>
+          <w:rStyle w:val="Hyperlink"/>
+          <w:u w:val="none"/>
+        </w:rPr>
+        <w:t>format</w:t>
+      </w:r>
       <w:r>
         <w:rPr>
           <w:rFonts w:ascii="Times New Roman" w:eastAsia="Times New Roman" w:hAnsi="Times New Roman" w:cs="Times New Roman"/>
           <w:szCs w:val="20"/>
           <w:lang w:eastAsia="en-US"/>
         </w:rPr>
-        <w:t xml:space="preserve">Your report should be submitted using the ACM template, and be 6-8 pages in length (6 pages minimum), excluding the list of references. You are required to search for reliable sources and cite them with appropriate reference </w:t>
-      </w:r>
-      <w:r>
-        <w:rPr>
-          <w:rStyle w:val="Hyperlink"/>
-          <w:u w:val="none"/>
-        </w:rPr>
-        <w:t>format</w:t>
-      </w:r>
-      <w:r>
-        <w:rPr>
-          <w:rFonts w:ascii="Times New Roman" w:eastAsia="Times New Roman" w:hAnsi="Times New Roman" w:cs="Times New Roman"/>
-          <w:szCs w:val="20"/>
-          <w:lang w:eastAsia="en-US"/>
-        </w:rPr>
         <w:t>.</w:t>
       </w:r>
     </w:p>
@@ -2262,7 +2828,7 @@
       <w:r>
         <w:t>DOI=</w:t>
       </w:r>
-      <w:hyperlink r:id="rId36" w:history="1">
+      <w:hyperlink r:id="rId33" w:history="1">
         <w:r>
           <w:rPr>
             <w:rStyle w:val="Hyperlink"/>
@@ -2313,7 +2879,7 @@
       <w:r>
         <w:t xml:space="preserve"> (Mar. 2022). DOI=</w:t>
       </w:r>
-      <w:hyperlink r:id="rId37" w:history="1">
+      <w:hyperlink r:id="rId34" w:history="1">
         <w:r>
           <w:rPr>
             <w:rStyle w:val="Hyperlink"/>
@@ -2352,27 +2918,89 @@
       <w:r>
         <w:t xml:space="preserve"> (Jul. 2021). DOI=</w:t>
       </w:r>
+      <w:hyperlink r:id="rId35" w:history="1">
+        <w:r>
+          <w:rPr>
+            <w:rStyle w:val="Hyperlink"/>
+            <w:u w:val="none"/>
+          </w:rPr>
+          <w:t>https://www.occrp.org/en/project/the-</w:t>
+        </w:r>
+        <w:r>
+          <w:rPr>
+            <w:rStyle w:val="Hyperlink"/>
+            <w:u w:val="none"/>
+          </w:rPr>
+          <w:t>pegasus-project/where-nso-group-came-from-and-why-its-just-the-tip-of-the-iceberg (7)</w:t>
+        </w:r>
+      </w:hyperlink>
+    </w:p>
+    <w:p>
+      <w:pPr>
+        <w:pStyle w:val="References"/>
+      </w:pPr>
+      <w:r>
+        <w:t xml:space="preserve">Kirchgaessner, Stephanie, Lewis, Paul, Pegg, David, Cutler, Sam, Lakhani, Nina, Safi, Michael. 2021. Revealed: leak uncovers global abuse of cyber-surveillance weapon. </w:t>
+      </w:r>
+      <w:r>
+        <w:rPr>
+          <w:i/>
+          <w:iCs/>
+        </w:rPr>
+        <w:t>The Pegasus Project.</w:t>
+      </w:r>
+      <w:r>
+        <w:t xml:space="preserve"> (Jul. 2021). DOI=</w:t>
+      </w:r>
+      <w:hyperlink r:id="rId36" w:history="1">
+        <w:r>
+          <w:rPr>
+            <w:rStyle w:val="Hyperlink"/>
+            <w:u w:val="none"/>
+          </w:rPr>
+          <w:t>https://www.theguardian.com/world/2021/jul/18/revealed-leak-uncovers-global-abuse-of-cyber-surveillance-weapon-nso-group-pegasus (4)</w:t>
+        </w:r>
+      </w:hyperlink>
+    </w:p>
+    <w:p>
+      <w:pPr>
+        <w:pStyle w:val="References"/>
+      </w:pPr>
+      <w:hyperlink r:id="rId37" w:history="1">
+        <w:r>
+          <w:rPr>
+            <w:rStyle w:val="Hyperlink"/>
+            <w:u w:val="none"/>
+          </w:rPr>
+          <w:t>https://forb</w:t>
+        </w:r>
+        <w:r>
+          <w:rPr>
+            <w:rStyle w:val="Hyperlink"/>
+            <w:u w:val="none"/>
+          </w:rPr>
+          <w:t>i</w:t>
+        </w:r>
+        <w:r>
+          <w:rPr>
+            <w:rStyle w:val="Hyperlink"/>
+            <w:u w:val="none"/>
+          </w:rPr>
+          <w:t>ddenstories.org/the-rise-and-fall-of-nso-group/ (3)</w:t>
+        </w:r>
+      </w:hyperlink>
+    </w:p>
+    <w:p>
+      <w:pPr>
+        <w:pStyle w:val="References"/>
+      </w:pPr>
       <w:hyperlink r:id="rId38" w:history="1">
         <w:r>
           <w:rPr>
             <w:rStyle w:val="Hyperlink"/>
             <w:u w:val="none"/>
           </w:rPr>
-          <w:t>https://www.occrp.org/en/project/the-pegasus-project/where-nso-gr</w:t>
-        </w:r>
-        <w:r>
-          <w:rPr>
-            <w:rStyle w:val="Hyperlink"/>
-            <w:u w:val="none"/>
-          </w:rPr>
-          <w:t>o</w:t>
-        </w:r>
-        <w:r>
-          <w:rPr>
-            <w:rStyle w:val="Hyperlink"/>
-            <w:u w:val="none"/>
-          </w:rPr>
-          <w:t>up-came-from-and-why-its-just-the-tip-of-the-iceberg (7)</w:t>
+          <w:t>https://www.reuters.com/sustainability/society-equity/us-court-orders-spyware-company-nso-stop-targeting-whatsapp-reduces-damages-2025-10-18/ (8)</w:t>
         </w:r>
       </w:hyperlink>
     </w:p>
@@ -2380,40 +3008,27 @@
       <w:pPr>
         <w:pStyle w:val="References"/>
       </w:pPr>
-      <w:r>
-        <w:t xml:space="preserve">Kirchgaessner, Stephanie, Lewis, Paul, Pegg, David, Cutler, Sam, Lakhani, Nina, Safi, Michael. 2021. Revealed: leak uncovers global abuse of cyber-surveillance weapon. </w:t>
-      </w:r>
-      <w:r>
-        <w:rPr>
-          <w:i/>
-          <w:iCs/>
-        </w:rPr>
-        <w:t>The Pegasus Project.</w:t>
-      </w:r>
-      <w:r>
-        <w:t xml:space="preserve"> (Jul. 2021). DOI=</w:t>
-      </w:r>
       <w:hyperlink r:id="rId39" w:history="1">
         <w:r>
           <w:rPr>
             <w:rStyle w:val="Hyperlink"/>
             <w:u w:val="none"/>
           </w:rPr>
-          <w:t>https://www.th</w:t>
+          <w:t>https://en.wikipedia.org/wiki/Entity_List (9)</w:t>
         </w:r>
+      </w:hyperlink>
+    </w:p>
+    <w:p>
+      <w:pPr>
+        <w:pStyle w:val="References"/>
+      </w:pPr>
+      <w:hyperlink r:id="rId40" w:history="1">
         <w:r>
           <w:rPr>
             <w:rStyle w:val="Hyperlink"/>
             <w:u w:val="none"/>
           </w:rPr>
-          <w:t>e</w:t>
-        </w:r>
-        <w:r>
-          <w:rPr>
-            <w:rStyle w:val="Hyperlink"/>
-            <w:u w:val="none"/>
-          </w:rPr>
-          <w:t>guardian.com/world/2021/jul/18/revealed-leak-uncovers-global-abuse-of-cyber-surveillance-weapon-nso-group-pegasus (4)</w:t>
+          <w:t>https://www.brookings.edu/articles/lessons-for-policymakers-from-the-nso-group-saga/ (10)</w:t>
         </w:r>
       </w:hyperlink>
     </w:p>
@@ -3379,7 +3994,6 @@
         <w:pStyle w:val="Abstract"/>
       </w:pPr>
       <w:r>
-        <w:lastRenderedPageBreak/>
         <w:t xml:space="preserve">In this paper, we describe the formatting guidelines for ACM SIG Proceedings.  </w:t>
       </w:r>
     </w:p>
@@ -3540,7 +4154,7 @@
           <w:iCs/>
         </w:rPr>
       </w:pPr>
-      <w:hyperlink r:id="rId40" w:history="1">
+      <w:hyperlink r:id="rId41" w:history="1">
         <w:r>
           <w:rPr>
             <w:rStyle w:val="Hyperlink"/>
@@ -3558,7 +4172,7 @@
       <w:r>
         <w:t xml:space="preserve">Please read the </w:t>
       </w:r>
-      <w:hyperlink r:id="rId41" w:tooltip="CCSdoc" w:history="1">
+      <w:hyperlink r:id="rId42" w:tooltip="CCSdoc" w:history="1">
         <w:r>
           <w:rPr>
             <w:rStyle w:val="Hyperlink"/>
@@ -3621,6 +4235,7 @@
         <w:spacing w:before="120"/>
       </w:pPr>
       <w:r>
+        <w:lastRenderedPageBreak/>
         <w:t>PAGE SIZE</w:t>
       </w:r>
     </w:p>
@@ -3699,8 +4314,8 @@
         <w:pStyle w:val="Heading2"/>
         <w:spacing w:before="0"/>
       </w:pPr>
-      <w:smartTag w:uri="urn:schemas-microsoft-com:office:smarttags" w:element="place">
-        <w:smartTag w:uri="urn:schemas-microsoft-com:office:smarttags" w:element="City">
+      <w:smartTag w:uri="urn:schemas-microsoft-com:office:smarttags" w:element="City">
+        <w:smartTag w:uri="urn:schemas-microsoft-com:office:smarttags" w:element="place">
           <w:r>
             <w:t>Normal</w:t>
           </w:r>
@@ -4263,24 +4878,12 @@
       <w:r>
         <w:t xml:space="preserve"> Acceptable abbreviations, for journal names, can be found here: </w:t>
       </w:r>
-      <w:hyperlink r:id="rId42" w:history="1">
+      <w:hyperlink r:id="rId43" w:history="1">
         <w:r>
           <w:rPr>
             <w:rStyle w:val="Hyperlink"/>
           </w:rPr>
-          <w:t>http://lib</w:t>
-        </w:r>
-        <w:r>
-          <w:rPr>
-            <w:rStyle w:val="Hyperlink"/>
-          </w:rPr>
-          <w:t>r</w:t>
-        </w:r>
-        <w:r>
-          <w:rPr>
-            <w:rStyle w:val="Hyperlink"/>
-          </w:rPr>
-          <w:t>ary.caltech.edu/reference/abbreviations/</w:t>
+          <w:t>http://library.caltech.edu/reference/abbreviations/</w:t>
         </w:r>
       </w:hyperlink>
       <w:r>
@@ -4445,7 +5048,7 @@
                           </pic:cNvPicPr>
                         </pic:nvPicPr>
                         <pic:blipFill>
-                          <a:blip r:embed="rId43">
+                          <a:blip r:embed="rId44">
                             <a:extLst>
                               <a:ext uri="{28A0092B-C50C-407E-A947-70E740481C1C}">
                                 <a14:useLocalDpi xmlns:a14="http://schemas.microsoft.com/office/drawing/2010/main" val="0"/>
@@ -4610,7 +5213,7 @@
                   <o:lock v:ext="edit" aspectratio="t"/>
                 </v:shapetype>
                 <v:shape id="Picture 3" o:spid="_x0000_s1027" type="#_x0000_t75" alt="VRH-after" style="position:absolute;left:6381;top:1444;width:4860;height:2416;visibility:visible;mso-wrap-style:square" o:preferrelative="f" o:gfxdata="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">
-                  <v:imagedata r:id="rId44" o:title="VRH-after"/>
+                  <v:imagedata r:id="rId45" o:title="VRH-after"/>
                 </v:shape>
                 <v:shapetype id="_x0000_t202" coordsize="21600,21600" o:spt="202" path="m,l,21600r21600,l21600,xe">
                   <v:stroke joinstyle="miter"/>
@@ -4804,7 +5407,7 @@
       <w:r>
         <w:t xml:space="preserve"> 15, 5 (Nov. 1993), 795-825. DOI= </w:t>
       </w:r>
-      <w:hyperlink r:id="rId45" w:history="1">
+      <w:hyperlink r:id="rId46" w:history="1">
         <w:r>
           <w:rPr>
             <w:rStyle w:val="Hyperlink"/>
@@ -4856,8 +5459,8 @@
       <w:r>
         <w:t xml:space="preserve"> at </w:t>
       </w:r>
-      <w:smartTag w:uri="urn:schemas-microsoft-com:office:smarttags" w:element="place">
-        <w:smartTag w:uri="urn:schemas-microsoft-com:office:smarttags" w:element="City">
+      <w:smartTag w:uri="urn:schemas-microsoft-com:office:smarttags" w:element="City">
+        <w:smartTag w:uri="urn:schemas-microsoft-com:office:smarttags" w:element="place">
           <w:r>
             <w:t>College Park</w:t>
           </w:r>
@@ -4904,8 +5507,8 @@
       <w:r>
         <w:t xml:space="preserve">, The </w:t>
       </w:r>
-      <w:smartTag w:uri="urn:schemas-microsoft-com:office:smarttags" w:element="place">
-        <w:smartTag w:uri="urn:schemas-microsoft-com:office:smarttags" w:element="country-region">
+      <w:smartTag w:uri="urn:schemas-microsoft-com:office:smarttags" w:element="country-region">
+        <w:smartTag w:uri="urn:schemas-microsoft-com:office:smarttags" w:element="place">
           <w:r>
             <w:t>Netherlands</w:t>
           </w:r>
@@ -4932,7 +5535,7 @@
       <w:r>
         <w:t xml:space="preserve">, 526-531. DOI= </w:t>
       </w:r>
-      <w:hyperlink r:id="rId46" w:history="1">
+      <w:hyperlink r:id="rId47" w:history="1">
         <w:r>
           <w:rPr>
             <w:rStyle w:val="Hyperlink"/>
@@ -5128,7 +5731,7 @@
       <w:r>
         <w:t xml:space="preserve">, 1-10. DOI= </w:t>
       </w:r>
-      <w:hyperlink r:id="rId47" w:history="1">
+      <w:hyperlink r:id="rId48" w:history="1">
         <w:r>
           <w:rPr>
             <w:rStyle w:val="Hyperlink"/>
@@ -5161,7 +5764,7 @@
       <w:r>
         <w:t xml:space="preserve"> 79, 5 (May. 2006), 577-590. DOI= </w:t>
       </w:r>
-      <w:hyperlink r:id="rId48" w:history="1">
+      <w:hyperlink r:id="rId49" w:history="1">
         <w:r>
           <w:rPr>
             <w:rStyle w:val="Hyperlink"/>
@@ -5223,7 +5826,7 @@
       <w:r>
         <w:t xml:space="preserve">, 19-33. DOI= </w:t>
       </w:r>
-      <w:hyperlink r:id="rId49" w:history="1">
+      <w:hyperlink r:id="rId50" w:history="1">
         <w:r>
           <w:rPr>
             <w:rStyle w:val="Hyperlink"/>

</xml_diff>

<commit_message>
[Desktop] started on Prg2 for CS376 (removed animals.zip)
</commit_message>
<xml_diff>
--- a/CS205/PegasusEssay.docx
+++ b/CS205/PegasusEssay.docx
@@ -478,6 +478,7 @@
         </w:rPr>
         <w:t xml:space="preserve"> state governments can benefit from the use of Pegasus to support their </w:t>
       </w:r>
+      <w:proofErr w:type="gramStart"/>
       <w:r>
         <w:rPr>
           <w:sz w:val="24"/>
@@ -499,6 +500,7 @@
         </w:rPr>
         <w:t xml:space="preserve"> but</w:t>
       </w:r>
+      <w:proofErr w:type="gramEnd"/>
       <w:r>
         <w:rPr>
           <w:sz w:val="24"/>
@@ -564,6 +566,7 @@
         </w:rPr>
         <w:t xml:space="preserve">. The populations of all </w:t>
       </w:r>
+      <w:proofErr w:type="gramStart"/>
       <w:r>
         <w:rPr>
           <w:sz w:val="24"/>
@@ -571,6 +574,7 @@
         </w:rPr>
         <w:t>nation-states</w:t>
       </w:r>
+      <w:proofErr w:type="gramEnd"/>
       <w:r>
         <w:rPr>
           <w:sz w:val="24"/>
@@ -1567,6 +1571,7 @@
         </w:rPr>
         <w:t xml:space="preserve"> And it is this flexibility that makes </w:t>
       </w:r>
+      <w:proofErr w:type="gramStart"/>
       <w:r>
         <w:rPr>
           <w:rFonts w:ascii="Times New Roman" w:hAnsi="Times New Roman" w:cs="Times New Roman"/>
@@ -1583,6 +1588,7 @@
         </w:rPr>
         <w:t>exploit</w:t>
       </w:r>
+      <w:proofErr w:type="gramEnd"/>
       <w:r>
         <w:rPr>
           <w:rFonts w:ascii="Times New Roman" w:hAnsi="Times New Roman" w:cs="Times New Roman"/>
@@ -1800,6 +1806,7 @@
         </w:rPr>
         <w:t>“The compression algorithm is to simply substitute all </w:t>
       </w:r>
+      <w:proofErr w:type="gramStart"/>
       <w:r>
         <w:rPr>
           <w:i/>
@@ -1809,6 +1816,7 @@
         </w:rPr>
         <w:t>sufficiently-similar</w:t>
       </w:r>
+      <w:proofErr w:type="gramEnd"/>
       <w:r>
         <w:rPr>
           <w:sz w:val="24"/>
@@ -2116,7 +2124,39 @@
           <w:sz w:val="24"/>
           <w:szCs w:val="24"/>
         </w:rPr>
-        <w:t xml:space="preserve">“Rather than completely encoding the entire difference in one go, it can be done in steps, with each iteration using a logical operator (one of AND, OR, XOR or XNOR) to set, clear or flip bits. Each successive refinement step brings the rendered output closer to the original and this allows a level of control over the "lossiness" of the compression. The implementation of these refinement coding steps is very flexible and they are also able to "read" values already present on the output canvas.” (5) </w:t>
+        <w:t xml:space="preserve">“Rather than completely encoding the entire difference in one go, it can be done in steps, with each iteration using a logical operator (one of AND, </w:t>
+      </w:r>
+      <w:proofErr w:type="gramStart"/>
+      <w:r>
+        <w:rPr>
+          <w:sz w:val="24"/>
+          <w:szCs w:val="24"/>
+        </w:rPr>
+        <w:t>OR,</w:t>
+      </w:r>
+      <w:proofErr w:type="gramEnd"/>
+      <w:r>
+        <w:rPr>
+          <w:sz w:val="24"/>
+          <w:szCs w:val="24"/>
+        </w:rPr>
+        <w:t xml:space="preserve"> XOR or XNOR) to set, clear or flip bits. Each successive refinement step brings the rendered output closer to the original and this allows a level of control over the "lossiness" of the compression. The implementation of these refinement coding steps is very </w:t>
+      </w:r>
+      <w:proofErr w:type="gramStart"/>
+      <w:r>
+        <w:rPr>
+          <w:sz w:val="24"/>
+          <w:szCs w:val="24"/>
+        </w:rPr>
+        <w:t>flexible</w:t>
+      </w:r>
+      <w:proofErr w:type="gramEnd"/>
+      <w:r>
+        <w:rPr>
+          <w:sz w:val="24"/>
+          <w:szCs w:val="24"/>
+        </w:rPr>
+        <w:t xml:space="preserve"> and they are also able to "read" values already present on the output canvas.” (5) </w:t>
       </w:r>
       <w:r>
         <w:rPr>
@@ -2953,7 +2993,39 @@
           <w:sz w:val="24"/>
           <w:szCs w:val="24"/>
         </w:rPr>
-        <w:t xml:space="preserve">step inside and get to work. “JBIG2 doesn't have scripting capabilities, but when combined with a vulnerability, it does have the ability to emulate circuits of arbitrary logic gates operating on arbitrary memory. “ (5) Regardless of the possibility, exploiting this opportunity is still no easy task. “Using over 70,000 segment commands defining logical bit operations, they define a small computer architecture with features such as registers and a full 64-bit adder and comparator which they use to search memory and perform arithmetic operations.” (5) Over the course of a single JBIG2 decompression pass, and through the creative repurposing of refinement step operations, NSO was able to create a logical framework upon which to operate. The bootstrapping programs build for this FORCEDENTRY exploit are built to run on this rudimentary logical architecture. “It's not as </w:t>
+        <w:t xml:space="preserve">step inside and get to work. “JBIG2 doesn't have scripting capabilities, but when combined with a vulnerability, it does have the ability to emulate circuits of arbitrary logic gates operating on arbitrary memory. </w:t>
+      </w:r>
+      <w:proofErr w:type="gramStart"/>
+      <w:r>
+        <w:rPr>
+          <w:sz w:val="24"/>
+          <w:szCs w:val="24"/>
+        </w:rPr>
+        <w:t>“ (</w:t>
+      </w:r>
+      <w:proofErr w:type="gramEnd"/>
+      <w:r>
+        <w:rPr>
+          <w:sz w:val="24"/>
+          <w:szCs w:val="24"/>
+        </w:rPr>
+        <w:t xml:space="preserve">5) Regardless of the possibility, exploiting this opportunity is still no easy task. “Using over 70,000 segment commands defining logical bit operations, they define a small computer architecture with features such as registers and a full 64-bit adder and comparator which they use to search memory and perform arithmetic operations.” (5) Over the course of a single JBIG2 decompression pass, and through the creative repurposing of refinement step operations, NSO was able to create a logical framework upon which to operate. The bootstrapping programs </w:t>
+      </w:r>
+      <w:proofErr w:type="gramStart"/>
+      <w:r>
+        <w:rPr>
+          <w:sz w:val="24"/>
+          <w:szCs w:val="24"/>
+        </w:rPr>
+        <w:t>build</w:t>
+      </w:r>
+      <w:proofErr w:type="gramEnd"/>
+      <w:r>
+        <w:rPr>
+          <w:sz w:val="24"/>
+          <w:szCs w:val="24"/>
+        </w:rPr>
+        <w:t xml:space="preserve"> for this FORCEDENTRY exploit are built to run on this rudimentary logical architecture. “It's not as </w:t>
       </w:r>
       <w:r>
         <w:rPr>
@@ -2999,21 +3071,7 @@
           <w:sz w:val="24"/>
           <w:szCs w:val="24"/>
         </w:rPr>
-        <w:t>Now we will decide if it is</w:t>
-      </w:r>
-      <w:r>
-        <w:rPr>
-          <w:sz w:val="24"/>
-          <w:szCs w:val="24"/>
-        </w:rPr>
-        <w:t xml:space="preserve"> ethical for a government or public agency to spy on a population without their consent in the interest of national security</w:t>
-      </w:r>
-      <w:r>
-        <w:rPr>
-          <w:sz w:val="24"/>
-          <w:szCs w:val="24"/>
-        </w:rPr>
-        <w:t xml:space="preserve">. We will view this question through a specific ethical framework, and then I will </w:t>
+        <w:t xml:space="preserve">Now we will decide if it is ethical for a government or public agency to spy on a population without their consent in the interest of national security. We will view this question through a specific ethical framework, and then I will </w:t>
       </w:r>
       <w:r>
         <w:rPr>
@@ -3215,9 +3273,11 @@
       <w:pPr>
         <w:pStyle w:val="Heading3"/>
       </w:pPr>
+      <w:proofErr w:type="gramStart"/>
       <w:r>
         <w:t>Certainty</w:t>
       </w:r>
+      <w:proofErr w:type="gramEnd"/>
     </w:p>
     <w:p>
       <w:pPr>
@@ -3247,21 +3307,32 @@
         </w:rPr>
         <w:t xml:space="preserve"> and gathering intelligence to base their decisions on in many indirect ways. </w:t>
       </w:r>
-      <w:r>
-        <w:rPr>
-          <w:sz w:val="24"/>
-          <w:szCs w:val="24"/>
-        </w:rPr>
-        <w:t>Certainty is 100%.</w:t>
+      <w:proofErr w:type="gramStart"/>
+      <w:r>
+        <w:rPr>
+          <w:sz w:val="24"/>
+          <w:szCs w:val="24"/>
+        </w:rPr>
+        <w:t>Certainty</w:t>
+      </w:r>
+      <w:proofErr w:type="gramEnd"/>
+      <w:r>
+        <w:rPr>
+          <w:sz w:val="24"/>
+          <w:szCs w:val="24"/>
+        </w:rPr>
+        <w:t xml:space="preserve"> is 100%.</w:t>
       </w:r>
     </w:p>
     <w:p>
       <w:pPr>
         <w:pStyle w:val="Heading3"/>
       </w:pPr>
+      <w:proofErr w:type="gramStart"/>
       <w:r>
         <w:t>Propinquity</w:t>
       </w:r>
+      <w:proofErr w:type="gramEnd"/>
     </w:p>
     <w:p>
       <w:pPr>
@@ -3417,21 +3488,7 @@
           <w:sz w:val="24"/>
           <w:szCs w:val="24"/>
         </w:rPr>
-        <w:t xml:space="preserve">Is it </w:t>
-      </w:r>
-      <w:r>
-        <w:rPr>
-          <w:sz w:val="24"/>
-          <w:szCs w:val="24"/>
-        </w:rPr>
-        <w:t>ethical for a government or public agency to spy on a population without their consent in the interest of national security</w:t>
-      </w:r>
-      <w:r>
-        <w:rPr>
-          <w:sz w:val="24"/>
-          <w:szCs w:val="24"/>
-        </w:rPr>
-        <w:t>? My conclusion is “No”. I present my argument below.</w:t>
+        <w:t>Is it ethical for a government or public agency to spy on a population without their consent in the interest of national security? My conclusion is “No”. I present my argument below.</w:t>
       </w:r>
     </w:p>
     <w:p>
@@ -3468,21 +3525,7 @@
           <w:sz w:val="24"/>
           <w:szCs w:val="24"/>
         </w:rPr>
-        <w:t>act of “</w:t>
-      </w:r>
-      <w:r>
-        <w:rPr>
-          <w:sz w:val="24"/>
-          <w:szCs w:val="24"/>
-        </w:rPr>
-        <w:t>authoritarian governments targeting dissidents, journalists and activists outside of their sovereign borders to silence dissent.</w:t>
-      </w:r>
-      <w:r>
-        <w:rPr>
-          <w:sz w:val="24"/>
-          <w:szCs w:val="24"/>
-        </w:rPr>
-        <w:t xml:space="preserve">” (5) Pegasus, the main tool for surveillance being analyzed in this paper, is no exception to this </w:t>
+        <w:t xml:space="preserve">act of “authoritarian governments targeting dissidents, journalists and activists outside of their sovereign borders to silence dissent.” (5) Pegasus, the main tool for surveillance being analyzed in this paper, is no exception to this </w:t>
       </w:r>
       <w:r>
         <w:rPr>
@@ -3519,7 +3562,53 @@
           <w:sz w:val="24"/>
           <w:szCs w:val="24"/>
         </w:rPr>
-        <w:t>” (11)</w:t>
+        <w:t>” (11) Not only does the ability to spy on a population allow you to practice transnational repression, but it also provides the option to cripple said population’s ability to heal from any acts of oppression enacted upon it. There are an infinite number of ways for a group of people to be harmed. It is impossible to prepare for all of them. It is up to us to choose where to direct our efforts, and to try and minimize immediate harm in our attempts to prevent future harm. However, we have not made a good name for ourselves in this respect. “</w:t>
+      </w:r>
+      <w:r>
+        <w:rPr>
+          <w:sz w:val="24"/>
+          <w:szCs w:val="24"/>
+        </w:rPr>
+        <w:t xml:space="preserve">The UN Human Rights Council has indeed </w:t>
+      </w:r>
+      <w:proofErr w:type="spellStart"/>
+      <w:r>
+        <w:rPr>
+          <w:sz w:val="24"/>
+          <w:szCs w:val="24"/>
+        </w:rPr>
+        <w:t>recognised</w:t>
+      </w:r>
+      <w:proofErr w:type="spellEnd"/>
+      <w:r>
+        <w:rPr>
+          <w:sz w:val="24"/>
+          <w:szCs w:val="24"/>
+        </w:rPr>
+        <w:t xml:space="preserve"> that many states have used antiterrorism powers as a cynical legal pretext to curtail freedom of expression, </w:t>
+      </w:r>
+      <w:proofErr w:type="spellStart"/>
+      <w:r>
+        <w:rPr>
+          <w:sz w:val="24"/>
+          <w:szCs w:val="24"/>
+        </w:rPr>
+        <w:t>legitimise</w:t>
+      </w:r>
+      <w:proofErr w:type="spellEnd"/>
+      <w:r>
+        <w:rPr>
+          <w:sz w:val="24"/>
+          <w:szCs w:val="24"/>
+        </w:rPr>
+        <w:t xml:space="preserve"> torture and other ill-treatment, and exert a chilling effect on minorities, activists, and political opposition.” (12) In fact, it seems we are promoting not only immediately harmful acts, but actively seeking ways to tear down our own tools and systems designed</w:t>
+      </w:r>
+      <w:r>
+        <w:rPr>
+          <w:sz w:val="24"/>
+          <w:szCs w:val="24"/>
+        </w:rPr>
+        <w:t xml:space="preserve"> for societal self-reflection. “</w:t>
       </w:r>
       <w:r>
         <w:rPr>
@@ -3527,74 +3616,6 @@
           <w:sz w:val="24"/>
           <w:szCs w:val="24"/>
         </w:rPr>
-        <w:t xml:space="preserve"> Not only does the ability to spy on a population allow you to practice transnational repression, but it also provides the option to cripple said population’s ability to heal from any acts of oppression enacted upon it. There are an infinite number of ways for a group of people to be harmed. It is impossible to prepare for all of them. It is up to us to choose where to direct our efforts, and to try and minimize immediate harm in our attempts to prevent future harm. However, we have not made a good name for ourselves in this respect. “</w:t>
-      </w:r>
-      <w:r>
-        <w:rPr>
-          <w:sz w:val="24"/>
-          <w:szCs w:val="24"/>
-        </w:rPr>
-        <w:t xml:space="preserve">The UN Human Rights Council has indeed </w:t>
-      </w:r>
-      <w:proofErr w:type="spellStart"/>
-      <w:r>
-        <w:rPr>
-          <w:sz w:val="24"/>
-          <w:szCs w:val="24"/>
-        </w:rPr>
-        <w:t>recognised</w:t>
-      </w:r>
-      <w:proofErr w:type="spellEnd"/>
-      <w:r>
-        <w:rPr>
-          <w:sz w:val="24"/>
-          <w:szCs w:val="24"/>
-        </w:rPr>
-        <w:t xml:space="preserve"> that many states have used antiterrorism powers as a cynical legal pretext to curtail freedom of expression, </w:t>
-      </w:r>
-      <w:proofErr w:type="spellStart"/>
-      <w:r>
-        <w:rPr>
-          <w:sz w:val="24"/>
-          <w:szCs w:val="24"/>
-        </w:rPr>
-        <w:t>legitimise</w:t>
-      </w:r>
-      <w:proofErr w:type="spellEnd"/>
-      <w:r>
-        <w:rPr>
-          <w:sz w:val="24"/>
-          <w:szCs w:val="24"/>
-        </w:rPr>
-        <w:t xml:space="preserve"> torture and other ill-treatment, and exert a chilling effect on minorities, activists, and political opposition.” (12)</w:t>
-      </w:r>
-      <w:r>
-        <w:rPr>
-          <w:sz w:val="24"/>
-          <w:szCs w:val="24"/>
-        </w:rPr>
-        <w:t xml:space="preserve"> In fact, it seems we are promoting not only immediately harmful acts, but actively seeking ways to tear down our own tools and systems designed</w:t>
-      </w:r>
-      <w:r>
-        <w:rPr>
-          <w:sz w:val="24"/>
-          <w:szCs w:val="24"/>
-        </w:rPr>
-        <w:t xml:space="preserve"> for societal self-reflection. </w:t>
-      </w:r>
-      <w:r>
-        <w:rPr>
-          <w:sz w:val="24"/>
-          <w:szCs w:val="24"/>
-        </w:rPr>
-        <w:t>“</w:t>
-      </w:r>
-      <w:r>
-        <w:rPr>
-          <w:bCs/>
-          <w:sz w:val="24"/>
-          <w:szCs w:val="24"/>
-        </w:rPr>
         <w:t>Along with journalists, Pegasus revelations confirm that human rights defenders are one of</w:t>
       </w:r>
       <w:r>
@@ -3602,14 +3623,7 @@
           <w:sz w:val="24"/>
           <w:szCs w:val="24"/>
         </w:rPr>
-        <w:t xml:space="preserve"> the key targets being subjected to secret surveillance.” (13)</w:t>
-      </w:r>
-      <w:r>
-        <w:rPr>
-          <w:sz w:val="24"/>
-          <w:szCs w:val="24"/>
-        </w:rPr>
-        <w:t xml:space="preserve"> In the face of mass surveillance having relatively neutral Purity, we have shown as agents of the tool, to strongly push for actions which cause immediate harm without being able to calculate the future harm we might be preventing.</w:t>
+        <w:t xml:space="preserve"> the key targets being subjected to secret surveillance.” (13) In the face of mass surveillance having relatively neutral Purity, we have shown as agents of the tool, to strongly push for actions which cause immediate harm without being able to calculate the future harm we might be preventing.</w:t>
       </w:r>
     </w:p>
     <w:p>
@@ -3632,21 +3646,7 @@
           <w:sz w:val="24"/>
           <w:szCs w:val="24"/>
         </w:rPr>
-        <w:t xml:space="preserve">There are ways to gather information which could help you defend against national threats that are less invasive and less powerful than Pegasus-like spyware. If those less invasive methods were the only players in this game, the act of spying on a population would be less psychologically damaging. But Pegasus is a fundamental part of the spyware industry, and this has a clear effect on the populations being spied on. </w:t>
-      </w:r>
-      <w:r>
-        <w:rPr>
-          <w:sz w:val="24"/>
-          <w:szCs w:val="24"/>
-        </w:rPr>
-        <w:t>“Short of not using a device, there is no way to prevent exploitation by a zero-click exploit; it's a weapon against which there is no defense.” (5)</w:t>
-      </w:r>
-      <w:r>
-        <w:rPr>
-          <w:sz w:val="24"/>
-          <w:szCs w:val="24"/>
-        </w:rPr>
-        <w:t xml:space="preserve"> </w:t>
+        <w:t xml:space="preserve">There are ways to gather information which could help you defend against national threats that are less invasive and less powerful than Pegasus-like spyware. If those less invasive methods were the only players in this game, the act of spying on a population would be less psychologically damaging. But Pegasus is a fundamental part of the spyware industry, and this has a clear effect on the populations being spied on. “Short of not using a device, there is no way to prevent exploitation by a zero-click exploit; it's a weapon against which there is no defense.” (5) </w:t>
       </w:r>
       <w:r>
         <w:rPr>
@@ -3859,28 +3859,7 @@
           <w:sz w:val="24"/>
           <w:szCs w:val="24"/>
         </w:rPr>
-        <w:t xml:space="preserve"> Dangerous actors will always exist and will always try to push their own agenda’s. It is up to the technical people of this world to understand this about reality. </w:t>
-      </w:r>
-      <w:r>
-        <w:rPr>
-          <w:sz w:val="24"/>
-          <w:szCs w:val="24"/>
-        </w:rPr>
-        <w:t>“Furthermore, as major US technology companies like Apple and Microsoft began automatically encrypting user communications in recent years, government agencies have sought alternative tools to bypass encryption.” (14)</w:t>
-      </w:r>
-      <w:r>
-        <w:rPr>
-          <w:sz w:val="24"/>
-          <w:szCs w:val="24"/>
-        </w:rPr>
-        <w:t xml:space="preserve"> Compared to the space of all potential national threats, the space of misuse for a piece of software is manageable. If computing professionals don’t put energy into developing defensive restrictions before releasing their products, the alternative is to try and heal the damage after it’s done. After witnessing how the damage caused by Pegasus was handled, it seems unlikely this will be effective. </w:t>
-      </w:r>
-      <w:r>
-        <w:rPr>
-          <w:sz w:val="24"/>
-          <w:szCs w:val="24"/>
-        </w:rPr>
-        <w:t>“Not one victim of spyware abuse has been awarded justice. Not one government has really been held accountable.” (15)</w:t>
+        <w:t xml:space="preserve"> Dangerous actors will always exist and will always try to push their own agenda’s. It is up to the technical people of this world to understand this about reality. “Furthermore, as major US technology companies like Apple and Microsoft began automatically encrypting user communications in recent years, government agencies have sought alternative tools to bypass encryption.” (14) Compared to the space of all potential national threats, the space of misuse for a piece of software is manageable. If computing professionals don’t put energy into developing defensive restrictions before releasing their products, the alternative is to try and heal the damage after it’s done. After witnessing how the damage caused by Pegasus was handled, it seems unlikely this will be effective. “Not one victim of spyware abuse has been awarded justice. Not one government has really been held accountable.” (15)</w:t>
       </w:r>
     </w:p>
     <w:p>
@@ -4021,134 +4000,128 @@
             <w:rStyle w:val="Hyperlink"/>
             <w:u w:val="none"/>
           </w:rPr>
-          <w:t>https://projectzero.g</w:t>
+          <w:t>https://projectzero.google/2021/12/a-deep-dive-into-nso-zero-click.html (5)</w:t>
+        </w:r>
+      </w:hyperlink>
+      <w:r>
+        <w:t>.</w:t>
+      </w:r>
+    </w:p>
+    <w:p>
+      <w:pPr>
+        <w:pStyle w:val="References"/>
+      </w:pPr>
+      <w:r>
+        <w:t>Beer</w:t>
+      </w:r>
+      <w:r>
+        <w:t>, Ian</w:t>
+      </w:r>
+      <w:r>
+        <w:t xml:space="preserve"> </w:t>
+      </w:r>
+      <w:r>
+        <w:t>and Bowman,</w:t>
+      </w:r>
+      <w:r>
+        <w:t xml:space="preserve"> Groß</w:t>
+      </w:r>
+      <w:r>
+        <w:t xml:space="preserve">., </w:t>
+      </w:r>
+      <w:r>
+        <w:t>Samuel</w:t>
+      </w:r>
+      <w:r>
+        <w:t xml:space="preserve">. 2022. FORCEDENTRY: Sandbox escape. </w:t>
+      </w:r>
+      <w:r>
+        <w:rPr>
+          <w:i/>
+          <w:iCs/>
+        </w:rPr>
+        <w:t>Google Project Zero.</w:t>
+      </w:r>
+      <w:r>
+        <w:t xml:space="preserve"> (Mar. 2022). DOI=</w:t>
+      </w:r>
+      <w:hyperlink r:id="rId18" w:history="1">
+        <w:r>
+          <w:rPr>
+            <w:rStyle w:val="Hyperlink"/>
+            <w:u w:val="none"/>
+          </w:rPr>
+          <w:t>https://support.apple.com/guide/security/blastdoor-for-messages-and-ids-secd3c881cee/web (6)</w:t>
+        </w:r>
+      </w:hyperlink>
+    </w:p>
+    <w:p>
+      <w:pPr>
+        <w:pStyle w:val="References"/>
+      </w:pPr>
+      <w:r>
+        <w:t>Lozovsky</w:t>
+      </w:r>
+      <w:r>
+        <w:t>eer</w:t>
+      </w:r>
+      <w:r>
+        <w:t xml:space="preserve">, </w:t>
+      </w:r>
+      <w:r>
+        <w:t>Ilya</w:t>
+      </w:r>
+      <w:r>
+        <w:t xml:space="preserve">. 2021. Where NSO group came from – and why it’s just the tip of the iceberg. </w:t>
+      </w:r>
+      <w:r>
+        <w:rPr>
+          <w:i/>
+          <w:iCs/>
+        </w:rPr>
+        <w:t>The Pegasus Project.</w:t>
+      </w:r>
+      <w:r>
+        <w:t xml:space="preserve"> (Jul. 2021). DOI=</w:t>
+      </w:r>
+      <w:hyperlink r:id="rId19" w:history="1">
+        <w:r>
+          <w:rPr>
+            <w:rStyle w:val="Hyperlink"/>
+            <w:u w:val="none"/>
+          </w:rPr>
+          <w:t>https://www</w:t>
         </w:r>
         <w:r>
           <w:rPr>
             <w:rStyle w:val="Hyperlink"/>
             <w:u w:val="none"/>
           </w:rPr>
-          <w:t>o</w:t>
+          <w:t>.</w:t>
         </w:r>
         <w:r>
           <w:rPr>
             <w:rStyle w:val="Hyperlink"/>
             <w:u w:val="none"/>
           </w:rPr>
-          <w:t>ogle/2021/12/a-deep-dive-into-nso-zero-click.html (5)</w:t>
+          <w:t>occrp.org/en/project/the-pegasus-project/where-nso-group-came-from-and-why-its-just-the-tip-of-the-iceberg (7)</w:t>
         </w:r>
       </w:hyperlink>
-      <w:r>
-        <w:t>.</w:t>
-      </w:r>
     </w:p>
     <w:p>
       <w:pPr>
         <w:pStyle w:val="References"/>
       </w:pPr>
       <w:r>
-        <w:t>Beer</w:t>
-      </w:r>
-      <w:r>
-        <w:t>, Ian</w:t>
-      </w:r>
-      <w:r>
-        <w:t xml:space="preserve"> </w:t>
-      </w:r>
-      <w:r>
-        <w:t>and Bowman,</w:t>
-      </w:r>
-      <w:r>
-        <w:t xml:space="preserve"> Groß</w:t>
-      </w:r>
-      <w:r>
-        <w:t xml:space="preserve">., </w:t>
-      </w:r>
-      <w:r>
-        <w:t>Samuel</w:t>
-      </w:r>
-      <w:r>
-        <w:t xml:space="preserve">. 2022. FORCEDENTRY: Sandbox escape. </w:t>
-      </w:r>
-      <w:r>
-        <w:rPr>
-          <w:i/>
-          <w:iCs/>
-        </w:rPr>
-        <w:t>Google Project Zero.</w:t>
-      </w:r>
-      <w:r>
-        <w:t xml:space="preserve"> (Mar. 2022). DOI=</w:t>
-      </w:r>
-      <w:hyperlink r:id="rId18" w:history="1">
-        <w:r>
-          <w:rPr>
-            <w:rStyle w:val="Hyperlink"/>
-            <w:u w:val="none"/>
-          </w:rPr>
-          <w:t>https://support.apple.com/g</w:t>
-        </w:r>
-        <w:r>
-          <w:rPr>
-            <w:rStyle w:val="Hyperlink"/>
-            <w:u w:val="none"/>
-          </w:rPr>
-          <w:t>u</w:t>
-        </w:r>
-        <w:r>
-          <w:rPr>
-            <w:rStyle w:val="Hyperlink"/>
-            <w:u w:val="none"/>
-          </w:rPr>
-          <w:t>ide/security/blastdoor-for-messages-and-ids-secd3c881cee/web (6)</w:t>
-        </w:r>
-      </w:hyperlink>
-    </w:p>
-    <w:p>
-      <w:pPr>
-        <w:pStyle w:val="References"/>
-      </w:pPr>
-      <w:r>
-        <w:t>Lozovsky</w:t>
-      </w:r>
-      <w:r>
-        <w:t>eer</w:t>
-      </w:r>
-      <w:r>
-        <w:t xml:space="preserve">, </w:t>
-      </w:r>
-      <w:r>
-        <w:t>Ilya</w:t>
-      </w:r>
-      <w:r>
-        <w:t xml:space="preserve">. 2021. Where NSO group came from – and why it’s just the tip of the iceberg. </w:t>
-      </w:r>
-      <w:r>
-        <w:rPr>
-          <w:i/>
-          <w:iCs/>
-        </w:rPr>
-        <w:t>The Pegasus Project.</w:t>
-      </w:r>
-      <w:r>
-        <w:t xml:space="preserve"> (Jul. 2021). DOI=</w:t>
-      </w:r>
-      <w:hyperlink r:id="rId19" w:history="1">
-        <w:r>
-          <w:rPr>
-            <w:rStyle w:val="Hyperlink"/>
-            <w:u w:val="none"/>
-          </w:rPr>
-          <w:t>https://www.occrp.org/en/project/the-pegasus-project/where-nso-group-came-from-and-why-its-just-the-tip-of-the-iceberg (7)</w:t>
-        </w:r>
-      </w:hyperlink>
-    </w:p>
-    <w:p>
-      <w:pPr>
-        <w:pStyle w:val="References"/>
-      </w:pPr>
-      <w:r>
-        <w:t xml:space="preserve">Kirchgaessner, Stephanie, Lewis, Paul, Pegg, David, Cutler, Sam, Lakhani, Nina, Safi, Michael. 2021. Revealed: leak uncovers global abuse of cyber-surveillance weapon. </w:t>
+        <w:t xml:space="preserve">Kirchgaessner, Stephanie, Lewis, Paul, Pegg, David, Cutler, Sam, Lakhani, Nina, Safi, Michael. 2021. Revealed: leak uncovers global abuse of cyber-surveillance </w:t>
+      </w:r>
+      <w:proofErr w:type="gramStart"/>
+      <w:r>
+        <w:t>weapon</w:t>
+      </w:r>
+      <w:proofErr w:type="gramEnd"/>
+      <w:r>
+        <w:t xml:space="preserve">. </w:t>
       </w:r>
       <w:r>
         <w:rPr>
@@ -4180,21 +4153,21 @@
             <w:rStyle w:val="Hyperlink"/>
             <w:u w:val="none"/>
           </w:rPr>
-          <w:t>https://for</w:t>
+          <w:t>https:/</w:t>
         </w:r>
         <w:r>
           <w:rPr>
             <w:rStyle w:val="Hyperlink"/>
             <w:u w:val="none"/>
           </w:rPr>
-          <w:t>b</w:t>
+          <w:t>/</w:t>
         </w:r>
         <w:r>
           <w:rPr>
             <w:rStyle w:val="Hyperlink"/>
             <w:u w:val="none"/>
           </w:rPr>
-          <w:t>iddenstories.org/the-rise-and-fall-of-nso-group/ (3)</w:t>
+          <w:t>forbiddenstories.org/the-rise-and-fall-of-nso-group/ (3)</w:t>
         </w:r>
       </w:hyperlink>
     </w:p>
@@ -4208,21 +4181,7 @@
             <w:rStyle w:val="Hyperlink"/>
             <w:u w:val="none"/>
           </w:rPr>
-          <w:t>https://www.reuters.com/sustainability/society-equity/us-court-orders-spyware-company-nso-stop-targeting-whatsapp-reduces-damages-2025-10-1</w:t>
-        </w:r>
-        <w:r>
-          <w:rPr>
-            <w:rStyle w:val="Hyperlink"/>
-            <w:u w:val="none"/>
-          </w:rPr>
-          <w:t>8</w:t>
-        </w:r>
-        <w:r>
-          <w:rPr>
-            <w:rStyle w:val="Hyperlink"/>
-            <w:u w:val="none"/>
-          </w:rPr>
-          <w:t>/ (8)</w:t>
+          <w:t>https://www.reuters.com/sustainability/society-equity/us-court-orders-spyware-company-nso-stop-targeting-whatsapp-reduces-damages-2025-10-18/ (8)</w:t>
         </w:r>
       </w:hyperlink>
     </w:p>
@@ -4236,21 +4195,7 @@
             <w:rStyle w:val="Hyperlink"/>
             <w:u w:val="none"/>
           </w:rPr>
-          <w:t>https://en.wikipedia.org/wiki/En</w:t>
-        </w:r>
-        <w:r>
-          <w:rPr>
-            <w:rStyle w:val="Hyperlink"/>
-            <w:u w:val="none"/>
-          </w:rPr>
-          <w:t>t</w:t>
-        </w:r>
-        <w:r>
-          <w:rPr>
-            <w:rStyle w:val="Hyperlink"/>
-            <w:u w:val="none"/>
-          </w:rPr>
-          <w:t>ity_List (9)</w:t>
+          <w:t>https://en.wikipedia.org/wiki/Entity_List (9)</w:t>
         </w:r>
       </w:hyperlink>
     </w:p>
@@ -4268,21 +4213,7 @@
             <w:rStyle w:val="Hyperlink"/>
             <w:u w:val="none"/>
           </w:rPr>
-          <w:t>https://www.brookings.edu/articles/lessons-for-policymakers-from-the-nso-g</w:t>
-        </w:r>
-        <w:r>
-          <w:rPr>
-            <w:rStyle w:val="Hyperlink"/>
-            <w:u w:val="none"/>
-          </w:rPr>
-          <w:t>r</w:t>
-        </w:r>
-        <w:r>
-          <w:rPr>
-            <w:rStyle w:val="Hyperlink"/>
-            <w:u w:val="none"/>
-          </w:rPr>
-          <w:t>oup-saga/ (10)</w:t>
+          <w:t>https://www.brookings.edu/articles/lessons-for-policymakers-from-the-nso-group-saga/ (10)</w:t>
         </w:r>
       </w:hyperlink>
     </w:p>
@@ -4296,21 +4227,7 @@
             <w:rStyle w:val="Hyperlink"/>
             <w:u w:val="none"/>
           </w:rPr>
-          <w:t>https://www.hrw.org/news/2022/01/26/human-rights-watch-among-pegasus-spywar</w:t>
-        </w:r>
-        <w:r>
-          <w:rPr>
-            <w:rStyle w:val="Hyperlink"/>
-            <w:u w:val="none"/>
-          </w:rPr>
-          <w:t>e</w:t>
-        </w:r>
-        <w:r>
-          <w:rPr>
-            <w:rStyle w:val="Hyperlink"/>
-            <w:u w:val="none"/>
-          </w:rPr>
-          <w:t>-targets (11)</w:t>
+          <w:t>https://www.hrw.org/news/2022/01/26/human-rights-watch-among-pegasus-spyware-targets (11)</w:t>
         </w:r>
       </w:hyperlink>
     </w:p>
@@ -4324,21 +4241,7 @@
             <w:rStyle w:val="Hyperlink"/>
             <w:u w:val="none"/>
           </w:rPr>
-          <w:t>https://www.europarl.europa.eu/RegData/etudes/STUD/2022/740514/IPOL_STU(2022)740514_E</w:t>
-        </w:r>
-        <w:r>
-          <w:rPr>
-            <w:rStyle w:val="Hyperlink"/>
-            <w:u w:val="none"/>
-          </w:rPr>
-          <w:t>N</w:t>
-        </w:r>
-        <w:r>
-          <w:rPr>
-            <w:rStyle w:val="Hyperlink"/>
-            <w:u w:val="none"/>
-          </w:rPr>
-          <w:t>.pdf (12)</w:t>
+          <w:t>https://www.europarl.europa.eu/RegData/etudes/STUD/2022/740514/IPOL_STU(2022)740514_EN.pdf (12)</w:t>
         </w:r>
       </w:hyperlink>
     </w:p>
@@ -4351,19 +4254,7 @@
           <w:rPr>
             <w:rStyle w:val="Hyperlink"/>
           </w:rPr>
-          <w:t>https://rm.</w:t>
-        </w:r>
-        <w:r>
-          <w:rPr>
-            <w:rStyle w:val="Hyperlink"/>
-          </w:rPr>
-          <w:t>c</w:t>
-        </w:r>
-        <w:r>
-          <w:rPr>
-            <w:rStyle w:val="Hyperlink"/>
-          </w:rPr>
-          <w:t>oe.int/pegasus-spyware-report-en/1680a6f5d8 (13)</w:t>
+          <w:t>https://rm.coe.int/pegasus-spyware-report-en/1680a6f5d8 (13)</w:t>
         </w:r>
       </w:hyperlink>
     </w:p>
@@ -4376,19 +4267,7 @@
           <w:rPr>
             <w:rStyle w:val="Hyperlink"/>
           </w:rPr>
-          <w:t>https://gjia.georgetown.edu/2024/09/0</w:t>
-        </w:r>
-        <w:r>
-          <w:rPr>
-            <w:rStyle w:val="Hyperlink"/>
-          </w:rPr>
-          <w:t>4</w:t>
-        </w:r>
-        <w:r>
-          <w:rPr>
-            <w:rStyle w:val="Hyperlink"/>
-          </w:rPr>
-          <w:t>/cyber-mercenaries-limiting-government-use-of-commercial-spyware/ (14)</w:t>
+          <w:t>https://gjia.georgetown.edu/2024/09/04/cyber-mercenaries-limiting-government-use-of-commercial-spyware/ (14)</w:t>
         </w:r>
       </w:hyperlink>
     </w:p>
@@ -4401,19 +4280,7 @@
           <w:rPr>
             <w:rStyle w:val="Hyperlink"/>
           </w:rPr>
-          <w:t>https://www.theguardian.com/world/2023/may/09/eu-parliament-rep</w:t>
-        </w:r>
-        <w:r>
-          <w:rPr>
-            <w:rStyle w:val="Hyperlink"/>
-          </w:rPr>
-          <w:t>o</w:t>
-        </w:r>
-        <w:r>
-          <w:rPr>
-            <w:rStyle w:val="Hyperlink"/>
-          </w:rPr>
-          <w:t>rt-calls-for-tighter-regulation-of-spyware (15)</w:t>
+          <w:t>https://www.theguardian.com/world/2023/may/09/eu-parliament-report-calls-for-tighter-regulation-of-spyware (15)</w:t>
         </w:r>
       </w:hyperlink>
     </w:p>
@@ -5615,7 +5482,15 @@
         <w:ind w:firstLine="0"/>
       </w:pPr>
       <w:r>
-        <w:t>The proceedings are the records of the conference. ACM hopes to give these conference by-products a single, high-quality appearance. To do this, we ask that authors follow some simple guidelines. In essence, we ask you to make your paper look exactly like this document. The easiest way to do this is simply to download a template from [2], and replace the content with your own material.</w:t>
+        <w:t>The proceedings are the records of the conference. ACM hopes to give these conference by-products a single, high-quality appearance. To do this, we ask that authors follow some simple guidelines. In essence, we ask you to make your paper look exactly like this document. The easiest way to do this is simply to download a template from [2</w:t>
+      </w:r>
+      <w:proofErr w:type="gramStart"/>
+      <w:r>
+        <w:t>], and</w:t>
+      </w:r>
+      <w:proofErr w:type="gramEnd"/>
+      <w:r>
+        <w:t xml:space="preserve"> replace the content with your own material.</w:t>
       </w:r>
     </w:p>
     <w:p>
@@ -5703,8 +5578,8 @@
         <w:pStyle w:val="Heading2"/>
         <w:spacing w:before="0"/>
       </w:pPr>
-      <w:smartTag w:uri="urn:schemas-microsoft-com:office:smarttags" w:element="place">
-        <w:smartTag w:uri="urn:schemas-microsoft-com:office:smarttags" w:element="City">
+      <w:smartTag w:uri="urn:schemas-microsoft-com:office:smarttags" w:element="City">
+        <w:smartTag w:uri="urn:schemas-microsoft-com:office:smarttags" w:element="place">
           <w:r>
             <w:t>Normal</w:t>
           </w:r>
@@ -5723,7 +5598,23 @@
         <w:t xml:space="preserve">SAMPLE: </w:t>
       </w:r>
       <w:r>
-        <w:t>Permission to make digital or hard copies of all or part of this work for personal or classroom use is granted without fee provided that copies are not made or distributed for profit or commercial advantage and that copies bear this notice and the full citation on the first page. To copy otherwise, or republish, to post on servers or to redistribute to lists, requires prior specific permission and/or a fee.</w:t>
+        <w:t xml:space="preserve">Permission to make digital or hard copies of all or part of this work for personal or classroom use is granted without fee </w:t>
+      </w:r>
+      <w:proofErr w:type="gramStart"/>
+      <w:r>
+        <w:t>provided that</w:t>
+      </w:r>
+      <w:proofErr w:type="gramEnd"/>
+      <w:r>
+        <w:t xml:space="preserve"> copies are not made or distributed for profit or commercial advantage and that copies bear this notice and the full citation on the first page. To copy otherwise, or republish, to post on servers or to redistribute to </w:t>
+      </w:r>
+      <w:proofErr w:type="gramStart"/>
+      <w:r>
+        <w:t>lists,</w:t>
+      </w:r>
+      <w:proofErr w:type="gramEnd"/>
+      <w:r>
+        <w:t xml:space="preserve"> requires prior specific permission and/or a fee.</w:t>
       </w:r>
     </w:p>
     <w:p>
@@ -5840,7 +5731,15 @@
         <w:ind w:firstLine="0"/>
       </w:pPr>
       <w:r>
-        <w:t>Please use a 9-point Times Roman font, or other Roman font with serifs, as close as possible in appearance to Times Roman in which these guidelines have been set. The goal is to have a 9-point text, as you see here. Please use sans-serif or non-proportional fonts only for special purposes, such as distinguishing source code text. If Times Roman is not available, try the font named Computer Modern Roman. On a Macintosh, use the font named Times.  Right margins should be justified, not ragged.</w:t>
+        <w:t xml:space="preserve">Please use a 9-point Times Roman font, or other Roman font with serifs, as close as possible in appearance to Times Roman in which these guidelines have been set. The goal is to have a 9-point </w:t>
+      </w:r>
+      <w:proofErr w:type="gramStart"/>
+      <w:r>
+        <w:t>text</w:t>
+      </w:r>
+      <w:proofErr w:type="gramEnd"/>
+      <w:r>
+        <w:t>, as you see here. Please use sans-serif or non-proportional fonts only for special purposes, such as distinguishing source code text. If Times Roman is not available, try the font named Computer Modern Roman. On a Macintosh, use the font named Times.  Right margins should be justified, not ragged.</w:t>
       </w:r>
     </w:p>
     <w:p>
@@ -6210,7 +6109,15 @@
         <w:spacing w:after="120"/>
       </w:pPr>
       <w:r>
-        <w:t>Footnotes should be Times New Roman 9-point, and justified to the full width of the column.</w:t>
+        <w:t>Footnotes should be Times New Roman 9-</w:t>
+      </w:r>
+      <w:proofErr w:type="gramStart"/>
+      <w:r>
+        <w:t>point, and</w:t>
+      </w:r>
+      <w:proofErr w:type="gramEnd"/>
+      <w:r>
+        <w:t xml:space="preserve"> justified to the full width of the column.</w:t>
       </w:r>
     </w:p>
     <w:p>
@@ -6279,7 +6186,15 @@
         <w:t xml:space="preserve">. Word may try to automatically ‘underline’ hotlinks in your </w:t>
       </w:r>
       <w:r>
-        <w:t>references, the correct style is NO underlining.</w:t>
+        <w:t xml:space="preserve">references, the correct style is </w:t>
+      </w:r>
+      <w:proofErr w:type="gramStart"/>
+      <w:r>
+        <w:t>NO</w:t>
+      </w:r>
+      <w:proofErr w:type="gramEnd"/>
+      <w:r>
+        <w:t xml:space="preserve"> underlining.</w:t>
       </w:r>
     </w:p>
     <w:p>
@@ -6287,7 +6202,31 @@
         <w:spacing w:after="120"/>
       </w:pPr>
       <w:r>
-        <w:t>The references are also in 9 pt., but that section (see Section 7) is ragged right. References should be published materials accessible to the public. Internal technical reports may be cited only if they are easily accessible (i.e. you can give the address to obtain the report within your citation) and may be obtained by any reader. Proprietary information may not be cited. Private communications should be acknowledged, not referenced  (e.g., “[Robertson, personal communication]”).</w:t>
+        <w:t xml:space="preserve">The references are also </w:t>
+      </w:r>
+      <w:proofErr w:type="gramStart"/>
+      <w:r>
+        <w:t>in</w:t>
+      </w:r>
+      <w:proofErr w:type="gramEnd"/>
+      <w:r>
+        <w:t xml:space="preserve"> 9 </w:t>
+      </w:r>
+      <w:proofErr w:type="gramStart"/>
+      <w:r>
+        <w:t>pt</w:t>
+      </w:r>
+      <w:proofErr w:type="gramEnd"/>
+      <w:r>
+        <w:t xml:space="preserve">., but that section (see Section 7) is ragged right. References should be published materials accessible to the public. Internal technical reports may be cited only if they are easily accessible (i.e. you can give the address to obtain the report within your citation) and may be obtained by any reader. Proprietary information may not be cited. Private communications should be acknowledged, not </w:t>
+      </w:r>
+      <w:proofErr w:type="gramStart"/>
+      <w:r>
+        <w:t>referenced  (</w:t>
+      </w:r>
+      <w:proofErr w:type="gramEnd"/>
+      <w:r>
+        <w:t>e.g., “[Robertson, personal communication]”).</w:t>
       </w:r>
     </w:p>
     <w:p>
@@ -6331,7 +6270,23 @@
         <w:spacing w:after="120"/>
       </w:pPr>
       <w:r>
-        <w:t>Captions should be Times New Roman 9-point bold.  They should be numbered (e.g., “Table 1” or “Figure 2”), please note that the word for Table and Figure are spelled out. Figure’s captions should be centered beneath the image or picture, and Table captions should be centered above the table body.</w:t>
+        <w:t xml:space="preserve">Captions should be Times New Roman 9-point bold.  They should be numbered (e.g., “Table 1” or “Figure 2”), please note that the word for Table and Figure </w:t>
+      </w:r>
+      <w:proofErr w:type="gramStart"/>
+      <w:r>
+        <w:t>are</w:t>
+      </w:r>
+      <w:proofErr w:type="gramEnd"/>
+      <w:r>
+        <w:t xml:space="preserve"> spelled out. </w:t>
+      </w:r>
+      <w:proofErr w:type="gramStart"/>
+      <w:r>
+        <w:t>Figure’s</w:t>
+      </w:r>
+      <w:proofErr w:type="gramEnd"/>
+      <w:r>
+        <w:t xml:space="preserve"> captions should be centered beneath the image or picture, and Table captions should be centered above the table body.</w:t>
       </w:r>
     </w:p>
     <w:p>
@@ -6766,8 +6721,13 @@
         <w:spacing w:after="120"/>
         <w:ind w:firstLine="0"/>
       </w:pPr>
-      <w:r>
-        <w:t>Our thanks to ACM SIGCHI for allowing us to modify templates they had developed.</w:t>
+      <w:proofErr w:type="gramStart"/>
+      <w:r>
+        <w:t>Our thanks</w:t>
+      </w:r>
+      <w:proofErr w:type="gramEnd"/>
+      <w:r>
+        <w:t xml:space="preserve"> to ACM SIGCHI for allowing us to modify templates they had developed.</w:t>
       </w:r>
     </w:p>
     <w:p>
@@ -6848,8 +6808,8 @@
       <w:r>
         <w:t xml:space="preserve"> at </w:t>
       </w:r>
-      <w:smartTag w:uri="urn:schemas-microsoft-com:office:smarttags" w:element="place">
-        <w:smartTag w:uri="urn:schemas-microsoft-com:office:smarttags" w:element="City">
+      <w:smartTag w:uri="urn:schemas-microsoft-com:office:smarttags" w:element="City">
+        <w:smartTag w:uri="urn:schemas-microsoft-com:office:smarttags" w:element="place">
           <w:r>
             <w:t>College Park</w:t>
           </w:r>
@@ -6896,8 +6856,8 @@
       <w:r>
         <w:t xml:space="preserve">, The </w:t>
       </w:r>
-      <w:smartTag w:uri="urn:schemas-microsoft-com:office:smarttags" w:element="place">
-        <w:smartTag w:uri="urn:schemas-microsoft-com:office:smarttags" w:element="country-region">
+      <w:smartTag w:uri="urn:schemas-microsoft-com:office:smarttags" w:element="country-region">
+        <w:smartTag w:uri="urn:schemas-microsoft-com:office:smarttags" w:element="place">
           <w:r>
             <w:t>Netherlands</w:t>
           </w:r>
@@ -7268,7 +7228,23 @@
         <w:pStyle w:val="Paper-Title"/>
       </w:pPr>
       <w:r>
-        <w:t>Columns on Last Page Should Be Made As Close As Possible to Equal Length</w:t>
+        <w:t xml:space="preserve">Columns on Last Page Should Be Made </w:t>
+      </w:r>
+      <w:proofErr w:type="gramStart"/>
+      <w:r>
+        <w:t>As</w:t>
+      </w:r>
+      <w:proofErr w:type="gramEnd"/>
+      <w:r>
+        <w:t xml:space="preserve"> Close </w:t>
+      </w:r>
+      <w:proofErr w:type="gramStart"/>
+      <w:r>
+        <w:t>As</w:t>
+      </w:r>
+      <w:proofErr w:type="gramEnd"/>
+      <w:r>
+        <w:t xml:space="preserve"> Possible to Equal Length</w:t>
       </w:r>
     </w:p>
     <w:sectPr>
@@ -8423,6 +8399,7 @@
   <w:style w:type="character" w:default="1" w:styleId="DefaultParagraphFont">
     <w:name w:val="Default Paragraph Font"/>
     <w:uiPriority w:val="1"/>
+    <w:semiHidden/>
     <w:unhideWhenUsed/>
   </w:style>
   <w:style w:type="table" w:default="1" w:styleId="TableNormal">

</xml_diff>